<commit_message>
feat(regime): complete PDL Regime L1 with tuning flow and report
</commit_message>
<xml_diff>
--- a/docs/Regime_Specification_Livello_1_final.docx
+++ b/docs/Regime_Specification_Livello_1_final.docx
@@ -5,34 +5,69 @@
     <w:p>
       <w:pPr>
         <w:pStyle w:val="Titolo"/>
-        <w:rPr>
-          <w:lang w:val="it-IT"/>
-        </w:rPr>
       </w:pPr>
-      <w:r>
-        <w:rPr>
-          <w:lang w:val="it-IT"/>
-        </w:rPr>
-        <w:t xml:space="preserve">Regime </w:t>
-      </w:r>
       <w:proofErr w:type="spellStart"/>
       <w:r>
         <w:rPr>
-          <w:lang w:val="it-IT"/>
-        </w:rPr>
-        <w:t>Specification</w:t>
+          <w:rStyle w:val="TitoloCarattere"/>
+        </w:rPr>
+        <w:t>Filtro</w:t>
       </w:r>
       <w:proofErr w:type="spellEnd"/>
       <w:r>
         <w:rPr>
-          <w:lang w:val="it-IT"/>
-        </w:rPr>
-        <w:t xml:space="preserve"> – Livello 1</w:t>
-      </w:r>
+          <w:rStyle w:val="TitoloCarattere"/>
+        </w:rPr>
+        <w:t xml:space="preserve"> di REGIME – </w:t>
+      </w:r>
+      <w:proofErr w:type="spellStart"/>
+      <w:r>
+        <w:rPr>
+          <w:rStyle w:val="TitoloCarattere"/>
+        </w:rPr>
+        <w:t>Livello</w:t>
+      </w:r>
+      <w:proofErr w:type="spellEnd"/>
+      <w:r>
+        <w:rPr>
+          <w:rStyle w:val="TitoloCarattere"/>
+        </w:rPr>
+        <w:t xml:space="preserve"> 1 (</w:t>
+      </w:r>
+      <w:proofErr w:type="spellStart"/>
+      <w:r>
+        <w:rPr>
+          <w:rStyle w:val="TitoloCarattere"/>
+        </w:rPr>
+        <w:t>Uso</w:t>
+      </w:r>
+      <w:proofErr w:type="spellEnd"/>
+      <w:r>
+        <w:rPr>
+          <w:rStyle w:val="TitoloCarattere"/>
+        </w:rPr>
+        <w:t xml:space="preserve"> </w:t>
+      </w:r>
+      <w:proofErr w:type="spellStart"/>
+      <w:r>
+        <w:rPr>
+          <w:rStyle w:val="TitoloCarattere"/>
+        </w:rPr>
+        <w:t>Operativo</w:t>
+      </w:r>
+      <w:proofErr w:type="spellEnd"/>
+      <w:r>
+        <w:rPr>
+          <w:rStyle w:val="TitoloCarattere"/>
+        </w:rPr>
+        <w:t>)</w:t>
+      </w:r>
+      <w:bookmarkStart w:id="0" w:name="_GoBack"/>
+      <w:bookmarkEnd w:id="0"/>
     </w:p>
     <w:p>
       <w:pPr>
-        <w:pStyle w:val="Titolo2"/>
+        <w:pStyle w:val="Titolo1"/>
         <w:rPr>
           <w:lang w:val="it-IT"/>
         </w:rPr>
@@ -41,7 +76,7 @@
         <w:rPr>
           <w:lang w:val="it-IT"/>
         </w:rPr>
-        <w:t>1. Scopo del documento</w:t>
+        <w:t>1. Scopo e perimetro del filtro</w:t>
       </w:r>
     </w:p>
     <w:p>
@@ -54,210 +89,66 @@
         <w:rPr>
           <w:lang w:val="it-IT"/>
         </w:rPr>
-        <w:t xml:space="preserve">Questo documento definisce in modo formale la specifica del modello di classificazione dei regimi di mercato Livello 1, progettato per l’uso operativo nella suite </w:t>
+        <w:t xml:space="preserve">Il filtro di REGIME – Livello 1 (REGIME_L1) è un </w:t>
       </w:r>
       <w:proofErr w:type="spellStart"/>
       <w:r>
         <w:rPr>
           <w:lang w:val="it-IT"/>
         </w:rPr>
-        <w:t>Py_SUITE_TRADING</w:t>
+        <w:t>permission</w:t>
       </w:r>
       <w:proofErr w:type="spellEnd"/>
       <w:r>
         <w:rPr>
           <w:lang w:val="it-IT"/>
         </w:rPr>
-        <w:t>. Il regime è inteso</w:t>
-      </w:r>
-      <w:r>
-        <w:rPr>
-          <w:lang w:val="it-IT"/>
-        </w:rPr>
-        <w:t xml:space="preserve"> come variabile di contesto per filtrare strategie e modulare il rischio, non come segnale di trading diretto.</w:t>
+        <w:t xml:space="preserve"> </w:t>
+      </w:r>
+      <w:proofErr w:type="spellStart"/>
+      <w:r>
+        <w:rPr>
+          <w:lang w:val="it-IT"/>
+        </w:rPr>
+        <w:t>layer</w:t>
+      </w:r>
+      <w:proofErr w:type="spellEnd"/>
+      <w:r>
+        <w:rPr>
+          <w:lang w:val="it-IT"/>
+        </w:rPr>
+        <w:t xml:space="preserve"> puro.</w:t>
+      </w:r>
+      <w:r>
+        <w:rPr>
+          <w:lang w:val="it-IT"/>
+        </w:rPr>
+        <w:br/>
+        <w:t>Non genera segnali, non impone direzionalità e non modifica la logica di entry/exit.</w:t>
+      </w:r>
+      <w:r>
+        <w:rPr>
+          <w:lang w:val="it-IT"/>
+        </w:rPr>
+        <w:br/>
+        <w:t>Il suo unico scopo è abilitare o bloccare l’apertura di nuove posizioni in base al contesto di mercato.</w:t>
       </w:r>
     </w:p>
     <w:p>
       <w:pPr>
-        <w:pStyle w:val="Titolo2"/>
         <w:rPr>
           <w:lang w:val="it-IT"/>
         </w:rPr>
       </w:pPr>
       <w:r>
         <w:rPr>
-          <w:lang w:val="it-IT"/>
-        </w:rPr>
-        <w:t>2. Principi di progettazione</w:t>
-      </w:r>
-    </w:p>
-    <w:p>
-      <w:pPr>
-        <w:rPr>
-          <w:lang w:val="it-IT"/>
-        </w:rPr>
-      </w:pPr>
-      <w:r>
-        <w:rPr>
-          <w:lang w:val="it-IT"/>
-        </w:rPr>
-        <w:t>- Separazione dei time-scale (macro vs tattico)</w:t>
-      </w:r>
-      <w:r>
-        <w:rPr>
-          <w:lang w:val="it-IT"/>
-        </w:rPr>
-        <w:br/>
-        <w:t>- Stabilità temporale e isteresi</w:t>
-      </w:r>
-      <w:r>
-        <w:rPr>
-          <w:lang w:val="it-IT"/>
-        </w:rPr>
-        <w:br/>
-        <w:t>- Interpretabilità deterministica</w:t>
-      </w:r>
-      <w:r>
-        <w:rPr>
-          <w:lang w:val="it-IT"/>
-        </w:rPr>
-        <w:br/>
-        <w:t>-</w:t>
-      </w:r>
-      <w:r>
-        <w:rPr>
-          <w:lang w:val="it-IT"/>
-        </w:rPr>
-        <w:t xml:space="preserve"> Robustezza out-of-sample</w:t>
-      </w:r>
-      <w:r>
-        <w:rPr>
-          <w:lang w:val="it-IT"/>
-        </w:rPr>
-        <w:br/>
-        <w:t xml:space="preserve">- Coerenza con best </w:t>
-      </w:r>
-      <w:proofErr w:type="spellStart"/>
-      <w:r>
-        <w:rPr>
-          <w:lang w:val="it-IT"/>
-        </w:rPr>
-        <w:t>practice</w:t>
-      </w:r>
-      <w:proofErr w:type="spellEnd"/>
-      <w:r>
-        <w:rPr>
-          <w:lang w:val="it-IT"/>
-        </w:rPr>
-        <w:t xml:space="preserve"> </w:t>
-      </w:r>
-      <w:proofErr w:type="spellStart"/>
-      <w:r>
-        <w:rPr>
-          <w:lang w:val="it-IT"/>
-        </w:rPr>
-        <w:t>buy</w:t>
-      </w:r>
-      <w:proofErr w:type="spellEnd"/>
-      <w:r>
-        <w:rPr>
-          <w:lang w:val="it-IT"/>
-        </w:rPr>
-        <w:t>-side</w:t>
-      </w:r>
-    </w:p>
-    <w:p>
-      <w:pPr>
-        <w:pStyle w:val="Titolo2"/>
-        <w:rPr>
-          <w:lang w:val="it-IT"/>
-        </w:rPr>
-      </w:pPr>
-      <w:r>
-        <w:rPr>
-          <w:lang w:val="it-IT"/>
-        </w:rPr>
-        <w:t>3. Output del modello</w:t>
-      </w:r>
-    </w:p>
-    <w:p>
-      <w:pPr>
-        <w:rPr>
-          <w:lang w:val="it-IT"/>
-        </w:rPr>
-      </w:pPr>
-      <w:r>
-        <w:rPr>
-          <w:lang w:val="it-IT"/>
-        </w:rPr>
-        <w:t>Per ogni barra temporale il modello produce:</w:t>
-      </w:r>
-      <w:r>
-        <w:rPr>
-          <w:lang w:val="it-IT"/>
-        </w:rPr>
-        <w:br/>
-        <w:t>- REGIME_RAW: classificazione tattica istantanea</w:t>
-      </w:r>
-      <w:r>
-        <w:rPr>
-          <w:lang w:val="it-IT"/>
-        </w:rPr>
-        <w:br/>
-        <w:t>- REGIME_FINAL: stato persistente con memoria</w:t>
-      </w:r>
-      <w:r>
-        <w:rPr>
-          <w:lang w:val="it-IT"/>
-        </w:rPr>
-        <w:br/>
-        <w:t>- REGIME_CODE: codifica numeri</w:t>
-      </w:r>
-      <w:r>
-        <w:rPr>
-          <w:lang w:val="it-IT"/>
-        </w:rPr>
-        <w:t>ca (0=MIXED, 1=RANGE_LOW_VOL, 2=TREND)</w:t>
-      </w:r>
-      <w:r>
-        <w:rPr>
-          <w:lang w:val="it-IT"/>
-        </w:rPr>
-        <w:br/>
-        <w:t xml:space="preserve">- (Opzionale) REGIME_P_TREND, REGIME_P_RANGE come </w:t>
-      </w:r>
-      <w:proofErr w:type="spellStart"/>
-      <w:r>
-        <w:rPr>
-          <w:lang w:val="it-IT"/>
-        </w:rPr>
-        <w:t>confidence</w:t>
-      </w:r>
-      <w:proofErr w:type="spellEnd"/>
-    </w:p>
-    <w:p>
-      <w:pPr>
-        <w:rPr>
-          <w:lang w:val="it-IT"/>
-        </w:rPr>
-      </w:pPr>
-    </w:p>
-    <w:p>
-      <w:pPr>
-        <w:jc w:val="center"/>
-        <w:rPr>
-          <w:lang w:val="it-IT"/>
-        </w:rPr>
-      </w:pPr>
-      <w:r>
-        <w:rPr>
           <w:noProof/>
           <w:lang w:val="it-IT"/>
         </w:rPr>
         <w:drawing>
-          <wp:inline distT="0" distB="0" distL="0" distR="0" wp14:anchorId="15DEFEF3" wp14:editId="26E7767D">
-            <wp:extent cx="2537290" cy="2468865"/>
-            <wp:effectExtent l="0" t="0" r="3175" b="0"/>
+          <wp:inline distT="0" distB="0" distL="0" distR="0">
+            <wp:extent cx="5382321" cy="4597399"/>
+            <wp:effectExtent l="0" t="0" r="0" b="0"/>
             <wp:docPr id="1" name="Immagine 1"/>
             <wp:cNvGraphicFramePr>
               <a:graphicFrameLocks xmlns:a="http://schemas.openxmlformats.org/drawingml/2006/main" noChangeAspect="1"/>
@@ -266,23 +157,30 @@
               <a:graphicData uri="http://schemas.openxmlformats.org/drawingml/2006/picture">
                 <pic:pic xmlns:pic="http://schemas.openxmlformats.org/drawingml/2006/picture">
                   <pic:nvPicPr>
-                    <pic:cNvPr id="1" name="CSV Data Extraction Flow-2026-02-04-091427.png"/>
+                    <pic:cNvPr id="1" name="Senza nome.drawio.txt.drawio-2.pdf"/>
                     <pic:cNvPicPr/>
                   </pic:nvPicPr>
-                  <pic:blipFill>
-                    <a:blip r:embed="rId6"/>
-                    <a:stretch>
-                      <a:fillRect/>
-                    </a:stretch>
+                  <pic:blipFill rotWithShape="1">
+                    <a:blip r:embed="rId8"/>
+                    <a:srcRect r="26829"/>
+                    <a:stretch/>
                   </pic:blipFill>
-                  <pic:spPr>
+                  <pic:spPr bwMode="auto">
                     <a:xfrm>
                       <a:off x="0" y="0"/>
-                      <a:ext cx="2547755" cy="2479048"/>
+                      <a:ext cx="5396737" cy="4609713"/>
                     </a:xfrm>
                     <a:prstGeom prst="rect">
                       <a:avLst/>
                     </a:prstGeom>
+                    <a:ln>
+                      <a:noFill/>
+                    </a:ln>
+                    <a:extLst>
+                      <a:ext uri="{53640926-AAD7-44D8-BBD7-CCE9431645EC}">
+                        <a14:shadowObscured xmlns:a14="http://schemas.microsoft.com/office/drawing/2010/main"/>
+                      </a:ext>
+                    </a:extLst>
                   </pic:spPr>
                 </pic:pic>
               </a:graphicData>
@@ -293,17 +191,10 @@
     </w:p>
     <w:p>
       <w:pPr>
-        <w:pStyle w:val="Titolo2"/>
         <w:rPr>
           <w:lang w:val="it-IT"/>
         </w:rPr>
       </w:pPr>
-      <w:r>
-        <w:rPr>
-          <w:lang w:val="it-IT"/>
-        </w:rPr>
-        <w:t>4. Input richiesti</w:t>
-      </w:r>
     </w:p>
     <w:p>
       <w:pPr>
@@ -311,31 +202,432 @@
           <w:lang w:val="it-IT"/>
         </w:rPr>
       </w:pPr>
-      <w:r>
-        <w:rPr>
-          <w:lang w:val="it-IT"/>
-        </w:rPr>
-        <w:t>Dati di base:</w:t>
+    </w:p>
+    <w:p>
+      <w:pPr>
+        <w:pStyle w:val="Titolo1"/>
+        <w:rPr>
+          <w:lang w:val="it-IT"/>
+        </w:rPr>
+      </w:pPr>
+      <w:r>
+        <w:rPr>
+          <w:lang w:val="it-IT"/>
+        </w:rPr>
+        <w:t>2. Stati di REGIME – Livello 1</w:t>
+      </w:r>
+    </w:p>
+    <w:p>
+      <w:pPr>
+        <w:rPr>
+          <w:lang w:val="it-IT"/>
+        </w:rPr>
+      </w:pPr>
+      <w:r>
+        <w:rPr>
+          <w:lang w:val="it-IT"/>
+        </w:rPr>
+        <w:t>Stati definiti:</w:t>
       </w:r>
       <w:r>
         <w:rPr>
           <w:lang w:val="it-IT"/>
         </w:rPr>
         <w:br/>
-        <w:t xml:space="preserve">- open, high, </w:t>
+        <w:t>- TREND: mercato direzionale strutturato</w:t>
+      </w:r>
+      <w:r>
+        <w:rPr>
+          <w:lang w:val="it-IT"/>
+        </w:rPr>
+        <w:br/>
+        <w:t>- RANGE: mercato laterale</w:t>
+      </w:r>
+      <w:r>
+        <w:rPr>
+          <w:lang w:val="it-IT"/>
+        </w:rPr>
+        <w:br/>
+        <w:t>- VOLATILE: mercato instabile</w:t>
+      </w:r>
+      <w:r>
+        <w:rPr>
+          <w:lang w:val="it-IT"/>
+        </w:rPr>
+        <w:br/>
+      </w:r>
+      <w:r>
+        <w:rPr>
+          <w:lang w:val="it-IT"/>
+        </w:rPr>
+        <w:lastRenderedPageBreak/>
+        <w:br/>
       </w:r>
       <w:proofErr w:type="spellStart"/>
       <w:r>
         <w:rPr>
           <w:lang w:val="it-IT"/>
         </w:rPr>
-        <w:t>low</w:t>
+        <w:t>Mapping</w:t>
       </w:r>
       <w:proofErr w:type="spellEnd"/>
       <w:r>
         <w:rPr>
           <w:lang w:val="it-IT"/>
         </w:rPr>
+        <w:t xml:space="preserve"> operativo:</w:t>
+      </w:r>
+      <w:r>
+        <w:rPr>
+          <w:lang w:val="it-IT"/>
+        </w:rPr>
+        <w:br/>
+        <w:t>TREND → nuove entry consentite</w:t>
+      </w:r>
+      <w:r>
+        <w:rPr>
+          <w:lang w:val="it-IT"/>
+        </w:rPr>
+        <w:br/>
+        <w:t>RANGE → nuove entry consentite</w:t>
+      </w:r>
+      <w:r>
+        <w:rPr>
+          <w:lang w:val="it-IT"/>
+        </w:rPr>
+        <w:br/>
+        <w:t>VOLATILE → nuove entry bloccate (exit sempre consentite)</w:t>
+      </w:r>
+    </w:p>
+    <w:p>
+      <w:pPr>
+        <w:pStyle w:val="Titolo1"/>
+        <w:rPr>
+          <w:lang w:val="it-IT"/>
+        </w:rPr>
+      </w:pPr>
+      <w:r>
+        <w:rPr>
+          <w:lang w:val="it-IT"/>
+        </w:rPr>
+        <w:t>3. Parametri di configurazione consolidati</w:t>
+      </w:r>
+    </w:p>
+    <w:p>
+      <w:pPr>
+        <w:rPr>
+          <w:lang w:val="it-IT"/>
+        </w:rPr>
+      </w:pPr>
+      <w:r>
+        <w:rPr>
+          <w:lang w:val="it-IT"/>
+        </w:rPr>
+        <w:t xml:space="preserve">ADX Trend </w:t>
+      </w:r>
+      <w:proofErr w:type="spellStart"/>
+      <w:r>
+        <w:rPr>
+          <w:lang w:val="it-IT"/>
+        </w:rPr>
+        <w:t>Enter</w:t>
+      </w:r>
+      <w:proofErr w:type="spellEnd"/>
+      <w:r>
+        <w:rPr>
+          <w:lang w:val="it-IT"/>
+        </w:rPr>
+        <w:t>: 20</w:t>
+      </w:r>
+      <w:r>
+        <w:rPr>
+          <w:lang w:val="it-IT"/>
+        </w:rPr>
+        <w:br/>
+        <w:t>ADX Trend Exit: 18</w:t>
+      </w:r>
+      <w:r>
+        <w:rPr>
+          <w:lang w:val="it-IT"/>
+        </w:rPr>
+        <w:br/>
+        <w:t xml:space="preserve">ADX </w:t>
+      </w:r>
+      <w:proofErr w:type="spellStart"/>
+      <w:r>
+        <w:rPr>
+          <w:lang w:val="it-IT"/>
+        </w:rPr>
+        <w:t>Range</w:t>
+      </w:r>
+      <w:proofErr w:type="spellEnd"/>
+      <w:r>
+        <w:rPr>
+          <w:lang w:val="it-IT"/>
+        </w:rPr>
+        <w:t xml:space="preserve"> </w:t>
+      </w:r>
+      <w:proofErr w:type="spellStart"/>
+      <w:r>
+        <w:rPr>
+          <w:lang w:val="it-IT"/>
+        </w:rPr>
+        <w:t>Enter</w:t>
+      </w:r>
+      <w:proofErr w:type="spellEnd"/>
+      <w:r>
+        <w:rPr>
+          <w:lang w:val="it-IT"/>
+        </w:rPr>
+        <w:t>: 15</w:t>
+      </w:r>
+      <w:r>
+        <w:rPr>
+          <w:lang w:val="it-IT"/>
+        </w:rPr>
+        <w:br/>
+        <w:t xml:space="preserve">ADX </w:t>
+      </w:r>
+      <w:proofErr w:type="spellStart"/>
+      <w:r>
+        <w:rPr>
+          <w:lang w:val="it-IT"/>
+        </w:rPr>
+        <w:t>Range</w:t>
+      </w:r>
+      <w:proofErr w:type="spellEnd"/>
+      <w:r>
+        <w:rPr>
+          <w:lang w:val="it-IT"/>
+        </w:rPr>
+        <w:t xml:space="preserve"> Exit: 17</w:t>
+      </w:r>
+      <w:r>
+        <w:rPr>
+          <w:lang w:val="it-IT"/>
+        </w:rPr>
+        <w:br/>
+        <w:t xml:space="preserve">ATR Volatile </w:t>
+      </w:r>
+      <w:proofErr w:type="spellStart"/>
+      <w:r>
+        <w:rPr>
+          <w:lang w:val="it-IT"/>
+        </w:rPr>
+        <w:t>Enter</w:t>
+      </w:r>
+      <w:proofErr w:type="spellEnd"/>
+      <w:r>
+        <w:rPr>
+          <w:lang w:val="it-IT"/>
+        </w:rPr>
+        <w:t>: 2.8</w:t>
+      </w:r>
+      <w:r>
+        <w:rPr>
+          <w:lang w:val="it-IT"/>
+        </w:rPr>
+        <w:br/>
+        <w:t>ATR Volatile Exit: 2.5</w:t>
+      </w:r>
+      <w:r>
+        <w:rPr>
+          <w:lang w:val="it-IT"/>
+        </w:rPr>
+        <w:br/>
+      </w:r>
+      <w:proofErr w:type="spellStart"/>
+      <w:r>
+        <w:rPr>
+          <w:lang w:val="it-IT"/>
+        </w:rPr>
+        <w:t>Confirm</w:t>
+      </w:r>
+      <w:proofErr w:type="spellEnd"/>
+      <w:r>
+        <w:rPr>
+          <w:lang w:val="it-IT"/>
+        </w:rPr>
+        <w:t xml:space="preserve"> </w:t>
+      </w:r>
+      <w:proofErr w:type="spellStart"/>
+      <w:r>
+        <w:rPr>
+          <w:lang w:val="it-IT"/>
+        </w:rPr>
+        <w:t>Bars</w:t>
+      </w:r>
+      <w:proofErr w:type="spellEnd"/>
+      <w:r>
+        <w:rPr>
+          <w:lang w:val="it-IT"/>
+        </w:rPr>
+        <w:t xml:space="preserve"> Trend: 2</w:t>
+      </w:r>
+      <w:r>
+        <w:rPr>
+          <w:lang w:val="it-IT"/>
+        </w:rPr>
+        <w:br/>
+      </w:r>
+      <w:proofErr w:type="spellStart"/>
+      <w:r>
+        <w:rPr>
+          <w:lang w:val="it-IT"/>
+        </w:rPr>
+        <w:t>Confirm</w:t>
+      </w:r>
+      <w:proofErr w:type="spellEnd"/>
+      <w:r>
+        <w:rPr>
+          <w:lang w:val="it-IT"/>
+        </w:rPr>
+        <w:t xml:space="preserve"> </w:t>
+      </w:r>
+      <w:proofErr w:type="spellStart"/>
+      <w:r>
+        <w:rPr>
+          <w:lang w:val="it-IT"/>
+        </w:rPr>
+        <w:t>Bars</w:t>
+      </w:r>
+      <w:proofErr w:type="spellEnd"/>
+      <w:r>
+        <w:rPr>
+          <w:lang w:val="it-IT"/>
+        </w:rPr>
+        <w:t xml:space="preserve"> </w:t>
+      </w:r>
+      <w:proofErr w:type="spellStart"/>
+      <w:r>
+        <w:rPr>
+          <w:lang w:val="it-IT"/>
+        </w:rPr>
+        <w:t>Range</w:t>
+      </w:r>
+      <w:proofErr w:type="spellEnd"/>
+      <w:r>
+        <w:rPr>
+          <w:lang w:val="it-IT"/>
+        </w:rPr>
+        <w:t>: 2</w:t>
+      </w:r>
+      <w:r>
+        <w:rPr>
+          <w:lang w:val="it-IT"/>
+        </w:rPr>
+        <w:br/>
+      </w:r>
+      <w:proofErr w:type="spellStart"/>
+      <w:r>
+        <w:rPr>
+          <w:lang w:val="it-IT"/>
+        </w:rPr>
+        <w:t>Confirm</w:t>
+      </w:r>
+      <w:proofErr w:type="spellEnd"/>
+      <w:r>
+        <w:rPr>
+          <w:lang w:val="it-IT"/>
+        </w:rPr>
+        <w:t xml:space="preserve"> </w:t>
+      </w:r>
+      <w:proofErr w:type="spellStart"/>
+      <w:r>
+        <w:rPr>
+          <w:lang w:val="it-IT"/>
+        </w:rPr>
+        <w:t>Bars</w:t>
+      </w:r>
+      <w:proofErr w:type="spellEnd"/>
+      <w:r>
+        <w:rPr>
+          <w:lang w:val="it-IT"/>
+        </w:rPr>
+        <w:t xml:space="preserve"> Volatile: 1</w:t>
+      </w:r>
+    </w:p>
+    <w:p>
+      <w:pPr>
+        <w:pStyle w:val="Titolo1"/>
+        <w:rPr>
+          <w:lang w:val="it-IT"/>
+        </w:rPr>
+      </w:pPr>
+      <w:r>
+        <w:rPr>
+          <w:lang w:val="it-IT"/>
+        </w:rPr>
+        <w:t xml:space="preserve">4. Processo di </w:t>
+      </w:r>
+      <w:proofErr w:type="spellStart"/>
+      <w:r>
+        <w:rPr>
+          <w:lang w:val="it-IT"/>
+        </w:rPr>
+        <w:t>tuning</w:t>
+      </w:r>
+      <w:proofErr w:type="spellEnd"/>
+    </w:p>
+    <w:p>
+      <w:pPr>
+        <w:rPr>
+          <w:lang w:val="it-IT"/>
+        </w:rPr>
+      </w:pPr>
+      <w:r>
+        <w:rPr>
+          <w:lang w:val="it-IT"/>
+        </w:rPr>
+        <w:t xml:space="preserve">Il </w:t>
+      </w:r>
+      <w:proofErr w:type="spellStart"/>
+      <w:r>
+        <w:rPr>
+          <w:lang w:val="it-IT"/>
+        </w:rPr>
+        <w:t>tuning</w:t>
+      </w:r>
+      <w:proofErr w:type="spellEnd"/>
+      <w:r>
+        <w:rPr>
+          <w:lang w:val="it-IT"/>
+        </w:rPr>
+        <w:t xml:space="preserve"> avviene esclusivamente tramite il modulo </w:t>
+      </w:r>
+      <w:proofErr w:type="spellStart"/>
+      <w:r>
+        <w:rPr>
+          <w:lang w:val="it-IT"/>
+        </w:rPr>
+        <w:t>regime_filter_report</w:t>
+      </w:r>
+      <w:proofErr w:type="spellEnd"/>
+      <w:r>
+        <w:rPr>
+          <w:lang w:val="it-IT"/>
+        </w:rPr>
+        <w:t>.</w:t>
+      </w:r>
+      <w:r>
+        <w:rPr>
+          <w:lang w:val="it-IT"/>
+        </w:rPr>
+        <w:br/>
+        <w:t xml:space="preserve">Il processo è incrementale: si modifica un parametro alla volta e si valutano </w:t>
+      </w:r>
+      <w:proofErr w:type="spellStart"/>
+      <w:r>
+        <w:rPr>
+          <w:lang w:val="it-IT"/>
+        </w:rPr>
+        <w:t>coverage</w:t>
+      </w:r>
+      <w:proofErr w:type="spellEnd"/>
+      <w:r>
+        <w:rPr>
+          <w:lang w:val="it-IT"/>
+        </w:rPr>
         <w:t xml:space="preserve">, </w:t>
       </w:r>
       <w:proofErr w:type="spellStart"/>
@@ -343,129 +635,104 @@
         <w:rPr>
           <w:lang w:val="it-IT"/>
         </w:rPr>
-        <w:t>close</w:t>
+        <w:t>run</w:t>
       </w:r>
       <w:proofErr w:type="spellEnd"/>
       <w:r>
         <w:rPr>
           <w:lang w:val="it-IT"/>
         </w:rPr>
+        <w:t xml:space="preserve"> </w:t>
+      </w:r>
+      <w:proofErr w:type="spellStart"/>
+      <w:r>
+        <w:rPr>
+          <w:lang w:val="it-IT"/>
+        </w:rPr>
+        <w:t>length</w:t>
+      </w:r>
+      <w:proofErr w:type="spellEnd"/>
+      <w:r>
+        <w:rPr>
+          <w:lang w:val="it-IT"/>
+        </w:rPr>
+        <w:t xml:space="preserve"> e </w:t>
+      </w:r>
+      <w:proofErr w:type="spellStart"/>
+      <w:r>
+        <w:rPr>
+          <w:lang w:val="it-IT"/>
+        </w:rPr>
+        <w:t>transition</w:t>
+      </w:r>
+      <w:proofErr w:type="spellEnd"/>
+      <w:r>
+        <w:rPr>
+          <w:lang w:val="it-IT"/>
+        </w:rPr>
+        <w:t xml:space="preserve"> </w:t>
+      </w:r>
+      <w:proofErr w:type="spellStart"/>
+      <w:r>
+        <w:rPr>
+          <w:lang w:val="it-IT"/>
+        </w:rPr>
+        <w:t>matrix</w:t>
+      </w:r>
+      <w:proofErr w:type="spellEnd"/>
+      <w:r>
+        <w:rPr>
+          <w:lang w:val="it-IT"/>
+        </w:rPr>
+        <w:t>.</w:t>
+      </w:r>
+      <w:r>
+        <w:rPr>
+          <w:lang w:val="it-IT"/>
+        </w:rPr>
         <w:br/>
-      </w:r>
-      <w:r>
-        <w:rPr>
-          <w:lang w:val="it-IT"/>
-        </w:rPr>
-        <w:br/>
-      </w:r>
-      <w:r>
-        <w:rPr>
-          <w:lang w:val="it-IT"/>
-        </w:rPr>
-        <w:lastRenderedPageBreak/>
-        <w:t>Indicatori già disponibili:</w:t>
-      </w:r>
-      <w:r>
-        <w:rPr>
-          <w:lang w:val="it-IT"/>
-        </w:rPr>
-        <w:br/>
-        <w:t>- KPI_ADX_14, KPI_DI_PLUS_14, KPI_DI_MINUS_14</w:t>
-      </w:r>
-      <w:r>
-        <w:rPr>
-          <w:lang w:val="it-IT"/>
-        </w:rPr>
-        <w:br/>
-        <w:t>- KPI_ATR_PCT_14</w:t>
-      </w:r>
-      <w:r>
-        <w:rPr>
-          <w:lang w:val="it-IT"/>
-        </w:rPr>
-        <w:br/>
-        <w:t>- KPI_</w:t>
-      </w:r>
-      <w:r>
-        <w:rPr>
-          <w:lang w:val="it-IT"/>
-        </w:rPr>
-        <w:t xml:space="preserve">BB_UP_20_2, KPI_BB_DN_20_2, KPI_BB_MID_20 (o </w:t>
+        <w:t xml:space="preserve">Il profitto non è una metrica di </w:t>
       </w:r>
       <w:proofErr w:type="spellStart"/>
       <w:r>
         <w:rPr>
           <w:lang w:val="it-IT"/>
         </w:rPr>
-        <w:t>Keltner</w:t>
+        <w:t>tuning</w:t>
       </w:r>
       <w:proofErr w:type="spellEnd"/>
       <w:r>
         <w:rPr>
           <w:lang w:val="it-IT"/>
         </w:rPr>
-        <w:t xml:space="preserve"> </w:t>
-      </w:r>
-      <w:proofErr w:type="spellStart"/>
-      <w:r>
-        <w:rPr>
-          <w:lang w:val="it-IT"/>
-        </w:rPr>
-        <w:t>Channels</w:t>
-      </w:r>
-      <w:proofErr w:type="spellEnd"/>
-      <w:r>
-        <w:rPr>
-          <w:lang w:val="it-IT"/>
-        </w:rPr>
-        <w:t>)</w:t>
-      </w:r>
-      <w:r>
-        <w:rPr>
-          <w:lang w:val="it-IT"/>
-        </w:rPr>
-        <w:br/>
-      </w:r>
-      <w:r>
-        <w:rPr>
-          <w:lang w:val="it-IT"/>
-        </w:rPr>
-        <w:br/>
-      </w:r>
-      <w:proofErr w:type="spellStart"/>
-      <w:r>
-        <w:rPr>
-          <w:lang w:val="it-IT"/>
-        </w:rPr>
-        <w:t>Feature</w:t>
-      </w:r>
-      <w:proofErr w:type="spellEnd"/>
-      <w:r>
-        <w:rPr>
-          <w:lang w:val="it-IT"/>
-        </w:rPr>
-        <w:t xml:space="preserve"> macro aggiuntive:</w:t>
-      </w:r>
-      <w:r>
-        <w:rPr>
-          <w:lang w:val="it-IT"/>
-        </w:rPr>
-        <w:br/>
-        <w:t>- log(</w:t>
-      </w:r>
-      <w:proofErr w:type="spellStart"/>
-      <w:r>
-        <w:rPr>
-          <w:lang w:val="it-IT"/>
-        </w:rPr>
-        <w:t>close</w:t>
-      </w:r>
-      <w:proofErr w:type="spellEnd"/>
-      <w:r>
-        <w:rPr>
-          <w:lang w:val="it-IT"/>
-        </w:rPr>
-        <w:t>)</w:t>
+        <w:t>.</w:t>
+      </w:r>
+    </w:p>
+    <w:p>
+      <w:pPr>
+        <w:pStyle w:val="Titolo1"/>
+        <w:rPr>
+          <w:lang w:val="it-IT"/>
+        </w:rPr>
+      </w:pPr>
+      <w:r>
+        <w:rPr>
+          <w:lang w:val="it-IT"/>
+        </w:rPr>
+        <w:t>5. Report di verifica</w:t>
+      </w:r>
+    </w:p>
+    <w:p>
+      <w:pPr>
+        <w:rPr>
+          <w:lang w:val="it-IT"/>
+        </w:rPr>
+      </w:pPr>
+      <w:r>
+        <w:rPr>
+          <w:lang w:val="it-IT"/>
+        </w:rPr>
+        <w:t>Il report produce un singolo CSV contenente:</w:t>
       </w:r>
       <w:r>
         <w:rPr>
@@ -479,28 +746,36 @@
         <w:rPr>
           <w:lang w:val="it-IT"/>
         </w:rPr>
-        <w:t>return</w:t>
+        <w:t>Dataset</w:t>
       </w:r>
       <w:proofErr w:type="spellEnd"/>
       <w:r>
         <w:rPr>
           <w:lang w:val="it-IT"/>
         </w:rPr>
-        <w:t xml:space="preserve"> logaritmico</w:t>
-      </w:r>
+        <w:t xml:space="preserve"> </w:t>
+      </w:r>
+      <w:proofErr w:type="spellStart"/>
+      <w:r>
+        <w:rPr>
+          <w:lang w:val="it-IT"/>
+        </w:rPr>
+        <w:t>Summary</w:t>
+      </w:r>
+      <w:proofErr w:type="spellEnd"/>
       <w:r>
         <w:rPr>
           <w:lang w:val="it-IT"/>
         </w:rPr>
         <w:br/>
-        <w:t xml:space="preserve">- volatilità </w:t>
+        <w:t xml:space="preserve">- Regime </w:t>
       </w:r>
       <w:proofErr w:type="spellStart"/>
       <w:r>
         <w:rPr>
           <w:lang w:val="it-IT"/>
         </w:rPr>
-        <w:t>rolling</w:t>
+        <w:t>Coverage</w:t>
       </w:r>
       <w:proofErr w:type="spellEnd"/>
       <w:r>
@@ -515,14 +790,195 @@
         <w:rPr>
           <w:lang w:val="it-IT"/>
         </w:rPr>
-        <w:t>slope</w:t>
+        <w:t>Run</w:t>
       </w:r>
       <w:proofErr w:type="spellEnd"/>
       <w:r>
         <w:rPr>
           <w:lang w:val="it-IT"/>
         </w:rPr>
-        <w:t xml:space="preserve"> regressione lineare su log-prezzi</w:t>
+        <w:t xml:space="preserve"> </w:t>
+      </w:r>
+      <w:proofErr w:type="spellStart"/>
+      <w:r>
+        <w:rPr>
+          <w:lang w:val="it-IT"/>
+        </w:rPr>
+        <w:t>Length</w:t>
+      </w:r>
+      <w:proofErr w:type="spellEnd"/>
+      <w:r>
+        <w:rPr>
+          <w:lang w:val="it-IT"/>
+        </w:rPr>
+        <w:t xml:space="preserve"> </w:t>
+      </w:r>
+      <w:proofErr w:type="spellStart"/>
+      <w:r>
+        <w:rPr>
+          <w:lang w:val="it-IT"/>
+        </w:rPr>
+        <w:t>Statistics</w:t>
+      </w:r>
+      <w:proofErr w:type="spellEnd"/>
+      <w:r>
+        <w:rPr>
+          <w:lang w:val="it-IT"/>
+        </w:rPr>
+        <w:br/>
+        <w:t xml:space="preserve">- </w:t>
+      </w:r>
+      <w:proofErr w:type="spellStart"/>
+      <w:r>
+        <w:rPr>
+          <w:lang w:val="it-IT"/>
+        </w:rPr>
+        <w:t>Transition</w:t>
+      </w:r>
+      <w:proofErr w:type="spellEnd"/>
+      <w:r>
+        <w:rPr>
+          <w:lang w:val="it-IT"/>
+        </w:rPr>
+        <w:t xml:space="preserve"> Matrix</w:t>
+      </w:r>
+      <w:r>
+        <w:rPr>
+          <w:lang w:val="it-IT"/>
+        </w:rPr>
+        <w:br/>
+        <w:t>Il report non entra nella pipeline di trading.</w:t>
+      </w:r>
+    </w:p>
+    <w:p>
+      <w:pPr>
+        <w:pStyle w:val="Titolo1"/>
+        <w:rPr>
+          <w:lang w:val="it-IT"/>
+        </w:rPr>
+      </w:pPr>
+      <w:r>
+        <w:rPr>
+          <w:lang w:val="it-IT"/>
+        </w:rPr>
+        <w:t>6. Integrazione in pipeline</w:t>
+      </w:r>
+    </w:p>
+    <w:p>
+      <w:pPr>
+        <w:rPr>
+          <w:lang w:val="it-IT"/>
+        </w:rPr>
+      </w:pPr>
+      <w:proofErr w:type="spellStart"/>
+      <w:r>
+        <w:rPr>
+          <w:lang w:val="it-IT"/>
+        </w:rPr>
+        <w:t>PyKPI_calcolo</w:t>
+      </w:r>
+      <w:proofErr w:type="spellEnd"/>
+      <w:r>
+        <w:rPr>
+          <w:lang w:val="it-IT"/>
+        </w:rPr>
+        <w:t>: calcolo e produzione delle colonne REGIME_L1.</w:t>
+      </w:r>
+      <w:r>
+        <w:rPr>
+          <w:lang w:val="it-IT"/>
+        </w:rPr>
+        <w:br/>
+      </w:r>
+      <w:proofErr w:type="spellStart"/>
+      <w:r>
+        <w:rPr>
+          <w:lang w:val="it-IT"/>
+        </w:rPr>
+        <w:t>Run_strategia</w:t>
+      </w:r>
+      <w:proofErr w:type="spellEnd"/>
+      <w:r>
+        <w:rPr>
+          <w:lang w:val="it-IT"/>
+        </w:rPr>
+        <w:t xml:space="preserve">: uso del regime come </w:t>
+      </w:r>
+      <w:proofErr w:type="spellStart"/>
+      <w:r>
+        <w:rPr>
+          <w:lang w:val="it-IT"/>
+        </w:rPr>
+        <w:t>permission</w:t>
+      </w:r>
+      <w:proofErr w:type="spellEnd"/>
+      <w:r>
+        <w:rPr>
+          <w:lang w:val="it-IT"/>
+        </w:rPr>
+        <w:t xml:space="preserve"> </w:t>
+      </w:r>
+      <w:proofErr w:type="spellStart"/>
+      <w:r>
+        <w:rPr>
+          <w:lang w:val="it-IT"/>
+        </w:rPr>
+        <w:t>layer</w:t>
+      </w:r>
+      <w:proofErr w:type="spellEnd"/>
+      <w:r>
+        <w:rPr>
+          <w:lang w:val="it-IT"/>
+        </w:rPr>
+        <w:t>.</w:t>
+      </w:r>
+      <w:r>
+        <w:rPr>
+          <w:lang w:val="it-IT"/>
+        </w:rPr>
+        <w:br/>
+      </w:r>
+      <w:proofErr w:type="spellStart"/>
+      <w:r>
+        <w:rPr>
+          <w:lang w:val="it-IT"/>
+        </w:rPr>
+        <w:t>Pipeline.command</w:t>
+      </w:r>
+      <w:proofErr w:type="spellEnd"/>
+      <w:r>
+        <w:rPr>
+          <w:lang w:val="it-IT"/>
+        </w:rPr>
+        <w:t xml:space="preserve">: nessuna configurazione </w:t>
+      </w:r>
+      <w:proofErr w:type="spellStart"/>
+      <w:r>
+        <w:rPr>
+          <w:lang w:val="it-IT"/>
+        </w:rPr>
+        <w:t>runtime</w:t>
+      </w:r>
+      <w:proofErr w:type="spellEnd"/>
+      <w:r>
+        <w:rPr>
+          <w:lang w:val="it-IT"/>
+        </w:rPr>
+        <w:t>.</w:t>
+      </w:r>
+    </w:p>
+    <w:p>
+      <w:pPr>
+        <w:pStyle w:val="Titolo1"/>
+        <w:rPr>
+          <w:lang w:val="it-IT"/>
+        </w:rPr>
+      </w:pPr>
+      <w:r>
+        <w:rPr>
+          <w:lang w:val="it-IT"/>
+        </w:rPr>
+        <w:t>APPENDICE TECNICA</w:t>
       </w:r>
     </w:p>
     <w:p>
@@ -536,7 +992,7 @@
         <w:rPr>
           <w:lang w:val="it-IT"/>
         </w:rPr>
-        <w:t>5. Definizione del Macro Regime</w:t>
+        <w:t>A1. Macchina a stati – REGIME_L1</w:t>
       </w:r>
     </w:p>
     <w:p>
@@ -549,13 +1005,7 @@
         <w:rPr>
           <w:lang w:val="it-IT"/>
         </w:rPr>
-        <w:t>Il Macro Regime identifica la presenz</w:t>
-      </w:r>
-      <w:r>
-        <w:rPr>
-          <w:lang w:val="it-IT"/>
-        </w:rPr>
-        <w:t>a di un trend strutturale.</w:t>
+        <w:t>Il filtro REGIME_L1 è implementato come una macchina a stati finiti (FSM).</w:t>
       </w:r>
       <w:r>
         <w:rPr>
@@ -568,145 +1018,75 @@
           <w:lang w:val="it-IT"/>
         </w:rPr>
         <w:br/>
-        <w:t>Metodo:</w:t>
+        <w:t>Stati:</w:t>
       </w:r>
       <w:r>
         <w:rPr>
           <w:lang w:val="it-IT"/>
         </w:rPr>
         <w:br/>
-        <w:t>- Regressione lineare su log(</w:t>
+      </w:r>
+      <w:r>
+        <w:rPr>
+          <w:lang w:val="it-IT"/>
+        </w:rPr>
+        <w:lastRenderedPageBreak/>
+        <w:t>- TREND</w:t>
+      </w:r>
+      <w:r>
+        <w:rPr>
+          <w:lang w:val="it-IT"/>
+        </w:rPr>
+        <w:br/>
+        <w:t>- RANGE</w:t>
+      </w:r>
+      <w:r>
+        <w:rPr>
+          <w:lang w:val="it-IT"/>
+        </w:rPr>
+        <w:br/>
+        <w:t>- VOLATILE</w:t>
+      </w:r>
+      <w:r>
+        <w:rPr>
+          <w:lang w:val="it-IT"/>
+        </w:rPr>
+        <w:br/>
+      </w:r>
+      <w:r>
+        <w:rPr>
+          <w:lang w:val="it-IT"/>
+        </w:rPr>
+        <w:br/>
+        <w:t>Le transizioni sono governate da soglie con isteresi (</w:t>
       </w:r>
       <w:proofErr w:type="spellStart"/>
       <w:r>
         <w:rPr>
           <w:lang w:val="it-IT"/>
         </w:rPr>
-        <w:t>close</w:t>
+        <w:t>enter</w:t>
       </w:r>
       <w:proofErr w:type="spellEnd"/>
       <w:r>
         <w:rPr>
           <w:lang w:val="it-IT"/>
         </w:rPr>
-        <w:t>) su finestra L (default 90 barre)</w:t>
-      </w:r>
-      <w:r>
-        <w:rPr>
-          <w:lang w:val="it-IT"/>
-        </w:rPr>
-        <w:br/>
-        <w:t xml:space="preserve">- Normalizzazione della </w:t>
+        <w:t>/exit) e conferme temporali (</w:t>
       </w:r>
       <w:proofErr w:type="spellStart"/>
       <w:r>
         <w:rPr>
           <w:lang w:val="it-IT"/>
         </w:rPr>
-        <w:t>slope</w:t>
+        <w:t>confirm_bars</w:t>
       </w:r>
       <w:proofErr w:type="spellEnd"/>
       <w:r>
         <w:rPr>
           <w:lang w:val="it-IT"/>
         </w:rPr>
-        <w:t xml:space="preserve"> tramite volatilità dei rendimenti</w:t>
-      </w:r>
-      <w:r>
-        <w:rPr>
-          <w:lang w:val="it-IT"/>
-        </w:rPr>
-        <w:br/>
-      </w:r>
-      <w:r>
-        <w:rPr>
-          <w:lang w:val="it-IT"/>
-        </w:rPr>
-        <w:br/>
-        <w:t>Criteri:</w:t>
-      </w:r>
-      <w:r>
-        <w:rPr>
-          <w:lang w:val="it-IT"/>
-        </w:rPr>
-        <w:br/>
-        <w:t>- |</w:t>
-      </w:r>
-      <w:proofErr w:type="spellStart"/>
-      <w:r>
-        <w:rPr>
-          <w:lang w:val="it-IT"/>
-        </w:rPr>
-        <w:t>TrendScore</w:t>
-      </w:r>
-      <w:proofErr w:type="spellEnd"/>
-      <w:r>
-        <w:rPr>
-          <w:lang w:val="it-IT"/>
-        </w:rPr>
-        <w:t xml:space="preserve">| ≥ </w:t>
-      </w:r>
-      <w:proofErr w:type="spellStart"/>
-      <w:r>
-        <w:rPr>
-          <w:lang w:val="it-IT"/>
-        </w:rPr>
-        <w:t>soglia_trend</w:t>
-      </w:r>
-      <w:proofErr w:type="spellEnd"/>
-      <w:r>
-        <w:rPr>
-          <w:lang w:val="it-IT"/>
-        </w:rPr>
-        <w:t xml:space="preserve"> → MACRO = TREND</w:t>
-      </w:r>
-      <w:r>
-        <w:rPr>
-          <w:lang w:val="it-IT"/>
-        </w:rPr>
-        <w:br/>
-        <w:t>- |</w:t>
-      </w:r>
-      <w:proofErr w:type="spellStart"/>
-      <w:r>
-        <w:rPr>
-          <w:lang w:val="it-IT"/>
-        </w:rPr>
-        <w:t>TrendScore</w:t>
-      </w:r>
-      <w:proofErr w:type="spellEnd"/>
-      <w:r>
-        <w:rPr>
-          <w:lang w:val="it-IT"/>
-        </w:rPr>
-        <w:t xml:space="preserve">| ≤ </w:t>
-      </w:r>
-      <w:proofErr w:type="spellStart"/>
-      <w:r>
-        <w:rPr>
-          <w:lang w:val="it-IT"/>
-        </w:rPr>
-        <w:t>soglia_range</w:t>
-      </w:r>
-      <w:proofErr w:type="spellEnd"/>
-      <w:r>
-        <w:rPr>
-          <w:lang w:val="it-IT"/>
-        </w:rPr>
-        <w:t xml:space="preserve"> →</w:t>
-      </w:r>
-      <w:r>
-        <w:rPr>
-          <w:lang w:val="it-IT"/>
-        </w:rPr>
-        <w:t xml:space="preserve"> MACRO = NON_TREND</w:t>
-      </w:r>
-      <w:r>
-        <w:rPr>
-          <w:lang w:val="it-IT"/>
-        </w:rPr>
-        <w:br/>
-        <w:t>- altrimenti → MACRO = UNCERTAIN</w:t>
+        <w:t>), al fine di evitare oscillazioni spurie di stato.</w:t>
       </w:r>
     </w:p>
     <w:p>
@@ -720,142 +1100,89 @@
         <w:rPr>
           <w:lang w:val="it-IT"/>
         </w:rPr>
-        <w:t>6. Definizione del Regime Tattico (REGIME_RAW)</w:t>
+        <w:t>A2. Logica di transizione (pseudo-codice)</w:t>
       </w:r>
     </w:p>
     <w:p>
-      <w:pPr>
-        <w:rPr>
-          <w:lang w:val="it-IT"/>
-        </w:rPr>
-      </w:pPr>
-      <w:r>
-        <w:rPr>
-          <w:lang w:val="it-IT"/>
-        </w:rPr>
-        <w:t>Il regime tattico descrive la struttura di breve periodo.</w:t>
-      </w:r>
-      <w:r>
-        <w:rPr>
-          <w:lang w:val="it-IT"/>
-        </w:rPr>
+      <w:r>
+        <w:t>Pseudo-</w:t>
+      </w:r>
+      <w:proofErr w:type="spellStart"/>
+      <w:r>
+        <w:t>codice</w:t>
+      </w:r>
+      <w:proofErr w:type="spellEnd"/>
+      <w:r>
+        <w:t xml:space="preserve"> </w:t>
+      </w:r>
+      <w:proofErr w:type="spellStart"/>
+      <w:r>
+        <w:t>semplificato</w:t>
+      </w:r>
+      <w:proofErr w:type="spellEnd"/>
+      <w:r>
+        <w:t>:</w:t>
+      </w:r>
+      <w:r>
         <w:br/>
       </w:r>
       <w:r>
-        <w:rPr>
-          <w:lang w:val="it-IT"/>
-        </w:rPr>
         <w:br/>
-        <w:t>TREND (</w:t>
+        <w:t xml:space="preserve">if </w:t>
       </w:r>
       <w:proofErr w:type="spellStart"/>
       <w:r>
-        <w:rPr>
-          <w:lang w:val="it-IT"/>
-        </w:rPr>
-        <w:t>raw</w:t>
+        <w:t>stato_corrente</w:t>
       </w:r>
       <w:proofErr w:type="spellEnd"/>
       <w:r>
-        <w:rPr>
-          <w:lang w:val="it-IT"/>
-        </w:rPr>
-        <w:t>):</w:t>
-      </w:r>
-      <w:r>
-        <w:rPr>
-          <w:lang w:val="it-IT"/>
-        </w:rPr>
+        <w:t xml:space="preserve"> == TREND:</w:t>
+      </w:r>
+      <w:r>
         <w:br/>
-        <w:t>- ADX ≥ 18</w:t>
-      </w:r>
-      <w:r>
-        <w:rPr>
-          <w:lang w:val="it-IT"/>
-        </w:rPr>
+        <w:t xml:space="preserve">    if ADX &lt; adx_trend_exit for confirm_bars_trend:</w:t>
+      </w:r>
+      <w:r>
         <w:br/>
-        <w:t>- Direzionalità coerente (DI+ vs DI-)</w:t>
-      </w:r>
-      <w:r>
-        <w:rPr>
-          <w:lang w:val="it-IT"/>
-        </w:rPr>
+        <w:t xml:space="preserve">        stato = RANGE</w:t>
+      </w:r>
+      <w:r>
         <w:br/>
       </w:r>
       <w:r>
-        <w:rPr>
-          <w:lang w:val="it-IT"/>
-        </w:rPr>
         <w:br/>
-        <w:t>RANGE_LOW_VOL (</w:t>
-      </w:r>
-      <w:proofErr w:type="spellStart"/>
-      <w:r>
-        <w:rPr>
-          <w:lang w:val="it-IT"/>
-        </w:rPr>
-        <w:t>raw</w:t>
-      </w:r>
-      <w:proofErr w:type="spellEnd"/>
-      <w:r>
-        <w:rPr>
-          <w:lang w:val="it-IT"/>
-        </w:rPr>
-        <w:t>):</w:t>
-      </w:r>
-      <w:r>
-        <w:rPr>
-          <w:lang w:val="it-IT"/>
-        </w:rPr>
+        <w:t>if stato_corrente == RANGE:</w:t>
+      </w:r>
+      <w:r>
         <w:br/>
-        <w:t>- ADX ≤ 14</w:t>
-      </w:r>
-      <w:r>
-        <w:rPr>
-          <w:lang w:val="it-IT"/>
-        </w:rPr>
+        <w:t xml:space="preserve">    if ADX &gt; adx_trend_enter for confirm_bars_trend:</w:t>
+      </w:r>
+      <w:r>
         <w:br/>
-        <w:t>- V</w:t>
-      </w:r>
-      <w:r>
-        <w:rPr>
-          <w:lang w:val="it-IT"/>
-        </w:rPr>
-        <w:t xml:space="preserve">olatilità compressa (BB </w:t>
-      </w:r>
-      <w:proofErr w:type="spellStart"/>
-      <w:r>
-        <w:rPr>
-          <w:lang w:val="it-IT"/>
-        </w:rPr>
-        <w:t>Width</w:t>
-      </w:r>
-      <w:proofErr w:type="spellEnd"/>
-      <w:r>
-        <w:rPr>
-          <w:lang w:val="it-IT"/>
-        </w:rPr>
-        <w:t xml:space="preserve"> sotto percentile 25)</w:t>
-      </w:r>
-      <w:r>
-        <w:rPr>
-          <w:lang w:val="it-IT"/>
-        </w:rPr>
+        <w:t xml:space="preserve">        stato = TREND</w:t>
+      </w:r>
+      <w:r>
         <w:br/>
-      </w:r>
-      <w:r>
-        <w:rPr>
-          <w:lang w:val="it-IT"/>
-        </w:rPr>
+        <w:t xml:space="preserve">    elif ATR_PCT &gt; atr_volatile_enter for confirm_bars_volatile:</w:t>
+      </w:r>
+      <w:r>
         <w:br/>
-        <w:t>MIXED:</w:t>
-      </w:r>
-      <w:r>
-        <w:rPr>
-          <w:lang w:val="it-IT"/>
-        </w:rPr>
+        <w:t xml:space="preserve">        stato = VOLATILE</w:t>
+      </w:r>
+      <w:r>
         <w:br/>
-        <w:t>- Tutti i casi residui</w:t>
+      </w:r>
+      <w:r>
+        <w:br/>
+        <w:t>if stato_corrente == VOLATILE:</w:t>
+      </w:r>
+      <w:r>
+        <w:br/>
+        <w:t xml:space="preserve">    if ATR_PCT &lt; atr_volatile_exit for confirm_bars_volatile:</w:t>
+      </w:r>
+      <w:r>
+        <w:br/>
+        <w:t xml:space="preserve">        stato = RANGE</w:t>
       </w:r>
     </w:p>
     <w:p>
@@ -869,7 +1196,7 @@
         <w:rPr>
           <w:lang w:val="it-IT"/>
         </w:rPr>
-        <w:t>7. State Machine e Regime Finale</w:t>
+        <w:t>A3. Colonne prodotte</w:t>
       </w:r>
     </w:p>
     <w:p>
@@ -882,7 +1209,7 @@
         <w:rPr>
           <w:lang w:val="it-IT"/>
         </w:rPr>
-        <w:t>REGIME_FINAL è ottenuto tramite una macchina a stati con isteresi.</w:t>
+        <w:t>Il modulo di classificazione REGIME_L1 produce le seguenti colonne:</w:t>
       </w:r>
       <w:r>
         <w:rPr>
@@ -895,130 +1222,49 @@
           <w:lang w:val="it-IT"/>
         </w:rPr>
         <w:br/>
-        <w:t>Entrata in TREND:</w:t>
+        <w:t>- REGIME_L1: stato finale utilizzato dalla strategia</w:t>
       </w:r>
       <w:r>
         <w:rPr>
           <w:lang w:val="it-IT"/>
         </w:rPr>
         <w:br/>
-        <w:t>- MACRO = TREND</w:t>
+        <w:t>- REGIME_L1_CODE: codifica numerica dello stato</w:t>
       </w:r>
       <w:r>
         <w:rPr>
           <w:lang w:val="it-IT"/>
         </w:rPr>
         <w:br/>
-        <w:t xml:space="preserve">- REGIME_RAW = TREND o EMA </w:t>
+        <w:t>- REGIME_L1_RAW: stato grezzo prima delle conferme</w:t>
+      </w:r>
+      <w:r>
+        <w:rPr>
+          <w:lang w:val="it-IT"/>
+        </w:rPr>
+        <w:br/>
+        <w:t>- REGIME_L1_REASON: motivazione tecnica dello stato</w:t>
+      </w:r>
+      <w:r>
+        <w:rPr>
+          <w:lang w:val="it-IT"/>
+        </w:rPr>
+        <w:br/>
+        <w:t xml:space="preserve">- REGIME_L1_SWITCH: </w:t>
       </w:r>
       <w:proofErr w:type="spellStart"/>
       <w:r>
         <w:rPr>
           <w:lang w:val="it-IT"/>
         </w:rPr>
-        <w:t>alignment</w:t>
+        <w:t>flag</w:t>
       </w:r>
       <w:proofErr w:type="spellEnd"/>
       <w:r>
         <w:rPr>
           <w:lang w:val="it-IT"/>
         </w:rPr>
-        <w:t xml:space="preserve"> co</w:t>
-      </w:r>
-      <w:r>
-        <w:rPr>
-          <w:lang w:val="it-IT"/>
-        </w:rPr>
-        <w:t>erente</w:t>
-      </w:r>
-      <w:r>
-        <w:rPr>
-          <w:lang w:val="it-IT"/>
-        </w:rPr>
-        <w:br/>
-        <w:t>- Persistenza ≥ K barre</w:t>
-      </w:r>
-      <w:r>
-        <w:rPr>
-          <w:lang w:val="it-IT"/>
-        </w:rPr>
-        <w:br/>
-      </w:r>
-      <w:r>
-        <w:rPr>
-          <w:lang w:val="it-IT"/>
-        </w:rPr>
-        <w:lastRenderedPageBreak/>
-        <w:br/>
-        <w:t>Uscita da TREND:</w:t>
-      </w:r>
-      <w:r>
-        <w:rPr>
-          <w:lang w:val="it-IT"/>
-        </w:rPr>
-        <w:br/>
-        <w:t>- MACRO ≠ TREND o ADX &lt; 14 per K barre</w:t>
-      </w:r>
-      <w:r>
-        <w:rPr>
-          <w:lang w:val="it-IT"/>
-        </w:rPr>
-        <w:br/>
-      </w:r>
-      <w:r>
-        <w:rPr>
-          <w:lang w:val="it-IT"/>
-        </w:rPr>
-        <w:br/>
-        <w:t>Entrata in RANGE_LOW_VOL:</w:t>
-      </w:r>
-      <w:r>
-        <w:rPr>
-          <w:lang w:val="it-IT"/>
-        </w:rPr>
-        <w:br/>
-        <w:t>- MACRO ≠ TREND</w:t>
-      </w:r>
-      <w:r>
-        <w:rPr>
-          <w:lang w:val="it-IT"/>
-        </w:rPr>
-        <w:br/>
-        <w:t>- REGIME_RAW = RANGE_LOW_VOL per K barre</w:t>
-      </w:r>
-      <w:r>
-        <w:rPr>
-          <w:lang w:val="it-IT"/>
-        </w:rPr>
-        <w:br/>
-      </w:r>
-      <w:r>
-        <w:rPr>
-          <w:lang w:val="it-IT"/>
-        </w:rPr>
-        <w:br/>
-        <w:t>Uscita da RANGE_LOW_VOL:</w:t>
-      </w:r>
-      <w:r>
-        <w:rPr>
-          <w:lang w:val="it-IT"/>
-        </w:rPr>
-        <w:br/>
-        <w:t xml:space="preserve">- Espansione volatilità o BB </w:t>
-      </w:r>
-      <w:proofErr w:type="spellStart"/>
-      <w:r>
-        <w:rPr>
-          <w:lang w:val="it-IT"/>
-        </w:rPr>
-        <w:t>Width</w:t>
-      </w:r>
-      <w:proofErr w:type="spellEnd"/>
-      <w:r>
-        <w:rPr>
-          <w:lang w:val="it-IT"/>
-        </w:rPr>
-        <w:t xml:space="preserve"> &gt; percentile 35</w:t>
+        <w:t xml:space="preserve"> di cambio stato (0/1)</w:t>
       </w:r>
     </w:p>
     <w:p>
@@ -1032,14 +1278,16 @@
         <w:rPr>
           <w:lang w:val="it-IT"/>
         </w:rPr>
-        <w:t>8. Codi</w:t>
-      </w:r>
-      <w:r>
-        <w:rPr>
-          <w:lang w:val="it-IT"/>
-        </w:rPr>
-        <w:t>fica dei regimi</w:t>
-      </w:r>
+        <w:t xml:space="preserve">A4. Integrazione in </w:t>
+      </w:r>
+      <w:proofErr w:type="spellStart"/>
+      <w:r>
+        <w:rPr>
+          <w:lang w:val="it-IT"/>
+        </w:rPr>
+        <w:t>Run_strategia</w:t>
+      </w:r>
+      <w:proofErr w:type="spellEnd"/>
     </w:p>
     <w:p>
       <w:pPr>
@@ -1051,21 +1299,96 @@
         <w:rPr>
           <w:lang w:val="it-IT"/>
         </w:rPr>
-        <w:t>MIXED = 0</w:t>
+        <w:t xml:space="preserve">In </w:t>
+      </w:r>
+      <w:proofErr w:type="spellStart"/>
+      <w:r>
+        <w:rPr>
+          <w:lang w:val="it-IT"/>
+        </w:rPr>
+        <w:t>Run_strategia</w:t>
+      </w:r>
+      <w:proofErr w:type="spellEnd"/>
+      <w:r>
+        <w:rPr>
+          <w:lang w:val="it-IT"/>
+        </w:rPr>
+        <w:t>, REGIME_L1 viene utilizzato esclusivamente come maschera di permesso:</w:t>
       </w:r>
       <w:r>
         <w:rPr>
           <w:lang w:val="it-IT"/>
         </w:rPr>
         <w:br/>
-        <w:t>RANGE_LOW_VOL = 1</w:t>
       </w:r>
       <w:r>
         <w:rPr>
           <w:lang w:val="it-IT"/>
         </w:rPr>
         <w:br/>
-        <w:t>TREND = 2</w:t>
+        <w:t xml:space="preserve">- </w:t>
+      </w:r>
+      <w:proofErr w:type="spellStart"/>
+      <w:r>
+        <w:rPr>
+          <w:lang w:val="it-IT"/>
+        </w:rPr>
+        <w:t>allow_trade</w:t>
+      </w:r>
+      <w:proofErr w:type="spellEnd"/>
+      <w:r>
+        <w:rPr>
+          <w:lang w:val="it-IT"/>
+        </w:rPr>
+        <w:t xml:space="preserve"> = False se REGIME_L1 == VOLATILE</w:t>
+      </w:r>
+      <w:r>
+        <w:rPr>
+          <w:lang w:val="it-IT"/>
+        </w:rPr>
+        <w:br/>
+        <w:t xml:space="preserve">- </w:t>
+      </w:r>
+      <w:proofErr w:type="spellStart"/>
+      <w:r>
+        <w:rPr>
+          <w:lang w:val="it-IT"/>
+        </w:rPr>
+        <w:t>allow_trade</w:t>
+      </w:r>
+      <w:proofErr w:type="spellEnd"/>
+      <w:r>
+        <w:rPr>
+          <w:lang w:val="it-IT"/>
+        </w:rPr>
+        <w:t xml:space="preserve"> = True negli altri casi</w:t>
+      </w:r>
+      <w:r>
+        <w:rPr>
+          <w:lang w:val="it-IT"/>
+        </w:rPr>
+        <w:br/>
+      </w:r>
+      <w:r>
+        <w:rPr>
+          <w:lang w:val="it-IT"/>
+        </w:rPr>
+        <w:br/>
+        <w:t xml:space="preserve">La maschera agisce solo sulle nuove entry. </w:t>
+      </w:r>
+      <w:proofErr w:type="gramStart"/>
+      <w:r>
+        <w:rPr>
+          <w:lang w:val="it-IT"/>
+        </w:rPr>
+        <w:t>Le exit</w:t>
+      </w:r>
+      <w:proofErr w:type="gramEnd"/>
+      <w:r>
+        <w:rPr>
+          <w:lang w:val="it-IT"/>
+        </w:rPr>
+        <w:t xml:space="preserve"> restano sempre abilitate.</w:t>
       </w:r>
     </w:p>
     <w:p>
@@ -1079,7 +1402,7 @@
         <w:rPr>
           <w:lang w:val="it-IT"/>
         </w:rPr>
-        <w:t>9. Uso operativo del regime</w:t>
+        <w:t>A5. Anti-pattern da evitare</w:t>
       </w:r>
     </w:p>
     <w:p>
@@ -1092,69 +1415,36 @@
         <w:rPr>
           <w:lang w:val="it-IT"/>
         </w:rPr>
-        <w:t>Il regime viene utilizzato per:</w:t>
+        <w:t>- Utilizzare REGIME_L1 per forzare chiusure di posizione</w:t>
       </w:r>
       <w:r>
         <w:rPr>
           <w:lang w:val="it-IT"/>
         </w:rPr>
         <w:br/>
-        <w:t>- Abilitare/disabilitare famiglie di strategie</w:t>
-      </w:r>
+        <w:t xml:space="preserve">- Ottimizzare i parametri su base </w:t>
+      </w:r>
+      <w:proofErr w:type="spellStart"/>
+      <w:r>
+        <w:rPr>
+          <w:lang w:val="it-IT"/>
+        </w:rPr>
+        <w:t>PnL</w:t>
+      </w:r>
+      <w:proofErr w:type="spellEnd"/>
       <w:r>
         <w:rPr>
           <w:lang w:val="it-IT"/>
         </w:rPr>
         <w:br/>
-        <w:t xml:space="preserve">- Modulazione </w:t>
-      </w:r>
-      <w:proofErr w:type="gramStart"/>
-      <w:r>
-        <w:rPr>
-          <w:lang w:val="it-IT"/>
-        </w:rPr>
-        <w:t>del position</w:t>
-      </w:r>
-      <w:proofErr w:type="gramEnd"/>
-      <w:r>
-        <w:rPr>
-          <w:lang w:val="it-IT"/>
-        </w:rPr>
-        <w:t xml:space="preserve"> </w:t>
-      </w:r>
-      <w:proofErr w:type="spellStart"/>
-      <w:r>
-        <w:rPr>
-          <w:lang w:val="it-IT"/>
-        </w:rPr>
-        <w:t>sizing</w:t>
-      </w:r>
-      <w:proofErr w:type="spellEnd"/>
+        <w:t>- Inserire logiche di direzionalità (LONG/SHORT)</w:t>
+      </w:r>
       <w:r>
         <w:rPr>
           <w:lang w:val="it-IT"/>
         </w:rPr>
         <w:br/>
-        <w:t>- Controllo del rischio</w:t>
-      </w:r>
-      <w:r>
-        <w:rPr>
-          <w:lang w:val="it-IT"/>
-        </w:rPr>
-        <w:br/>
-      </w:r>
-      <w:r>
-        <w:rPr>
-          <w:lang w:val="it-IT"/>
-        </w:rPr>
-        <w:br/>
-        <w:t>Non deve essere usato come trigger d</w:t>
-      </w:r>
-      <w:r>
-        <w:rPr>
-          <w:lang w:val="it-IT"/>
-        </w:rPr>
-        <w:t>i entry o exit.</w:t>
+        <w:t>- Modificare i parametri direttamente nella pipeline core</w:t>
       </w:r>
     </w:p>
     <w:p>
@@ -1168,7 +1458,8 @@
         <w:rPr>
           <w:lang w:val="it-IT"/>
         </w:rPr>
-        <w:t>10. Considerazioni finali</w:t>
+        <w:lastRenderedPageBreak/>
+        <w:t>A6. Estendibilità verso Livello 2</w:t>
       </w:r>
     </w:p>
     <w:p>
@@ -1181,1537 +1472,236 @@
         <w:rPr>
           <w:lang w:val="it-IT"/>
         </w:rPr>
-        <w:t>Questa specifica rappresenta il Livello 1: deterministico, interpretabile e pronto per la produzione.</w:t>
+        <w:t>Il REGIME_L1 costituisce la base per livelli superiori di classificazione.</w:t>
       </w:r>
       <w:r>
         <w:rPr>
           <w:lang w:val="it-IT"/>
         </w:rPr>
         <w:br/>
-        <w:t>Livelli successivi (HMM, ensemble) possono essere integrati come validazione o arricchimento probabilistico.</w:t>
-      </w:r>
-    </w:p>
-    <w:p>
-      <w:pPr>
-        <w:pStyle w:val="Titolo2"/>
-        <w:rPr>
-          <w:lang w:val="it-IT"/>
-        </w:rPr>
-      </w:pPr>
-      <w:r>
-        <w:rPr>
-          <w:lang w:val="it-IT"/>
-        </w:rPr>
-        <w:t>1</w:t>
-      </w:r>
-      <w:r>
-        <w:rPr>
-          <w:lang w:val="it-IT"/>
-        </w:rPr>
-        <w:t>1. Parametri di configurazione (Default)</w:t>
-      </w:r>
-    </w:p>
-    <w:p>
-      <w:pPr>
-        <w:rPr>
-          <w:lang w:val="it-IT"/>
-        </w:rPr>
-      </w:pPr>
-      <w:r>
-        <w:rPr>
-          <w:lang w:val="it-IT"/>
-        </w:rPr>
-        <w:t xml:space="preserve">Per mantenere il modello semplice e robusto, il Livello 1 espone un set minimo di parametri ad alta leva. Numero stati, logica FSM e </w:t>
-      </w:r>
-      <w:proofErr w:type="spellStart"/>
-      <w:r>
-        <w:rPr>
-          <w:lang w:val="it-IT"/>
-        </w:rPr>
-        <w:t>mapping</w:t>
-      </w:r>
-      <w:proofErr w:type="spellEnd"/>
-      <w:r>
-        <w:rPr>
-          <w:lang w:val="it-IT"/>
-        </w:rPr>
-        <w:t xml:space="preserve"> dei codici sono considerati architettura e rimangono hard-</w:t>
-      </w:r>
-      <w:proofErr w:type="spellStart"/>
-      <w:r>
-        <w:rPr>
-          <w:lang w:val="it-IT"/>
-        </w:rPr>
-        <w:t>coded</w:t>
-      </w:r>
-      <w:proofErr w:type="spellEnd"/>
-      <w:r>
-        <w:rPr>
-          <w:lang w:val="it-IT"/>
-        </w:rPr>
-        <w:t>.</w:t>
-      </w:r>
-    </w:p>
-    <w:p>
-      <w:pPr>
-        <w:pStyle w:val="Titolo3"/>
-      </w:pPr>
-      <w:r>
-        <w:t xml:space="preserve">11.1 Set </w:t>
-      </w:r>
-      <w:proofErr w:type="spellStart"/>
-      <w:r>
-        <w:t>minimo</w:t>
-      </w:r>
-      <w:proofErr w:type="spellEnd"/>
-      <w:r>
-        <w:t xml:space="preserve"> di parametri esposti</w:t>
-      </w:r>
-    </w:p>
-    <w:tbl>
-      <w:tblPr>
-        <w:tblStyle w:val="Grigliatabella"/>
-        <w:tblW w:w="9606" w:type="dxa"/>
-        <w:tblLayout w:type="fixed"/>
-        <w:tblLook w:val="04A0" w:firstRow="1" w:lastRow="0" w:firstColumn="1" w:lastColumn="0" w:noHBand="0" w:noVBand="1"/>
-      </w:tblPr>
-      <w:tblGrid>
-        <w:gridCol w:w="2093"/>
-        <w:gridCol w:w="992"/>
-        <w:gridCol w:w="2410"/>
-        <w:gridCol w:w="1701"/>
-        <w:gridCol w:w="2410"/>
-      </w:tblGrid>
-      <w:tr>
-        <w:tc>
-          <w:tcPr>
-            <w:tcW w:w="2093" w:type="dxa"/>
-          </w:tcPr>
-          <w:p>
-            <w:proofErr w:type="spellStart"/>
-            <w:r>
-              <w:t>Parametro</w:t>
-            </w:r>
-            <w:proofErr w:type="spellEnd"/>
-          </w:p>
-        </w:tc>
-        <w:tc>
-          <w:tcPr>
-            <w:tcW w:w="992" w:type="dxa"/>
-          </w:tcPr>
-          <w:p>
-            <w:r>
-              <w:t>Default</w:t>
-            </w:r>
-          </w:p>
-        </w:tc>
-        <w:tc>
-          <w:tcPr>
-            <w:tcW w:w="2410" w:type="dxa"/>
-          </w:tcPr>
-          <w:p>
-            <w:proofErr w:type="spellStart"/>
-            <w:r>
-              <w:t>Ruolo</w:t>
-            </w:r>
-            <w:proofErr w:type="spellEnd"/>
-          </w:p>
-        </w:tc>
-        <w:tc>
-          <w:tcPr>
-            <w:tcW w:w="1701" w:type="dxa"/>
-          </w:tcPr>
-          <w:p>
-            <w:r>
-              <w:t>Range</w:t>
-            </w:r>
-          </w:p>
-        </w:tc>
-        <w:tc>
-          <w:tcPr>
-            <w:tcW w:w="2410" w:type="dxa"/>
-          </w:tcPr>
-          <w:p>
-            <w:r>
-              <w:t>Note</w:t>
-            </w:r>
-          </w:p>
-        </w:tc>
-      </w:tr>
-      <w:tr>
-        <w:tc>
-          <w:tcPr>
-            <w:tcW w:w="2093" w:type="dxa"/>
-          </w:tcPr>
-          <w:p>
-            <w:r>
-              <w:t>L_MACRO</w:t>
-            </w:r>
-          </w:p>
-        </w:tc>
-        <w:tc>
-          <w:tcPr>
-            <w:tcW w:w="992" w:type="dxa"/>
-          </w:tcPr>
-          <w:p>
-            <w:r>
-              <w:t>90</w:t>
-            </w:r>
-          </w:p>
-        </w:tc>
-        <w:tc>
-          <w:tcPr>
-            <w:tcW w:w="2410" w:type="dxa"/>
-          </w:tcPr>
-          <w:p>
-            <w:pPr>
-              <w:rPr>
-                <w:lang w:val="it-IT"/>
-              </w:rPr>
-            </w:pPr>
-            <w:r>
-              <w:rPr>
-                <w:lang w:val="it-IT"/>
-              </w:rPr>
-              <w:t>Finestra macro regressione su log(</w:t>
-            </w:r>
-            <w:proofErr w:type="spellStart"/>
-            <w:r>
-              <w:rPr>
-                <w:lang w:val="it-IT"/>
-              </w:rPr>
-              <w:t>close</w:t>
-            </w:r>
-            <w:proofErr w:type="spellEnd"/>
-            <w:r>
-              <w:rPr>
-                <w:lang w:val="it-IT"/>
-              </w:rPr>
-              <w:t>)</w:t>
-            </w:r>
-          </w:p>
-        </w:tc>
-        <w:tc>
-          <w:tcPr>
-            <w:tcW w:w="1701" w:type="dxa"/>
-          </w:tcPr>
-          <w:p>
-            <w:r>
-              <w:t>60–120 intraday</w:t>
-            </w:r>
-            <w:r>
-              <w:br/>
-              <w:t>90–180 daily</w:t>
-            </w:r>
-          </w:p>
-        </w:tc>
-        <w:tc>
-          <w:tcPr>
-            <w:tcW w:w="2410" w:type="dxa"/>
-          </w:tcPr>
-          <w:p>
-            <w:r>
-              <w:t xml:space="preserve">↑ </w:t>
-            </w:r>
-            <w:proofErr w:type="spellStart"/>
-            <w:r>
-              <w:t>stabilità</w:t>
-            </w:r>
-            <w:proofErr w:type="spellEnd"/>
-            <w:r>
-              <w:br/>
-              <w:t xml:space="preserve">↓ </w:t>
-            </w:r>
-            <w:proofErr w:type="spellStart"/>
-            <w:r>
-              <w:t>reattività</w:t>
-            </w:r>
-            <w:proofErr w:type="spellEnd"/>
-          </w:p>
-        </w:tc>
-      </w:tr>
-      <w:tr>
-        <w:tc>
-          <w:tcPr>
-            <w:tcW w:w="2093" w:type="dxa"/>
-          </w:tcPr>
-          <w:p>
-            <w:r>
-              <w:t>TREND_STRENGTH</w:t>
-            </w:r>
-          </w:p>
-        </w:tc>
-        <w:tc>
-          <w:tcPr>
-            <w:tcW w:w="992" w:type="dxa"/>
-          </w:tcPr>
-          <w:p>
-            <w:r>
-              <w:t>0.35</w:t>
-            </w:r>
-          </w:p>
-        </w:tc>
-        <w:tc>
-          <w:tcPr>
-            <w:tcW w:w="2410" w:type="dxa"/>
-          </w:tcPr>
-          <w:p>
-            <w:pPr>
-              <w:rPr>
-                <w:lang w:val="it-IT"/>
-              </w:rPr>
-            </w:pPr>
-            <w:r>
-              <w:rPr>
-                <w:lang w:val="it-IT"/>
-              </w:rPr>
-              <w:t>Soglia su |</w:t>
-            </w:r>
-            <w:proofErr w:type="spellStart"/>
-            <w:r>
-              <w:rPr>
-                <w:lang w:val="it-IT"/>
-              </w:rPr>
-              <w:t>TrendScore</w:t>
-            </w:r>
-            <w:proofErr w:type="spellEnd"/>
-            <w:r>
-              <w:rPr>
-                <w:lang w:val="it-IT"/>
-              </w:rPr>
-              <w:t>| per MACRO=TREND</w:t>
-            </w:r>
-          </w:p>
-        </w:tc>
-        <w:tc>
-          <w:tcPr>
-            <w:tcW w:w="1701" w:type="dxa"/>
-          </w:tcPr>
-          <w:p>
-            <w:r>
-              <w:t>0.25–0.60</w:t>
-            </w:r>
-          </w:p>
-        </w:tc>
-        <w:tc>
-          <w:tcPr>
-            <w:tcW w:w="2410" w:type="dxa"/>
-          </w:tcPr>
-          <w:p>
-            <w:r>
-              <w:t>↑ selettivo</w:t>
-            </w:r>
-            <w:r>
-              <w:br/>
-              <w:t xml:space="preserve">↓ </w:t>
-            </w:r>
-            <w:r>
-              <w:t>TREND</w:t>
-            </w:r>
-          </w:p>
-        </w:tc>
-      </w:tr>
-      <w:tr>
-        <w:tc>
-          <w:tcPr>
-            <w:tcW w:w="2093" w:type="dxa"/>
-          </w:tcPr>
-          <w:p>
-            <w:r>
-              <w:t>ADX_LEVEL</w:t>
-            </w:r>
-          </w:p>
-        </w:tc>
-        <w:tc>
-          <w:tcPr>
-            <w:tcW w:w="992" w:type="dxa"/>
-          </w:tcPr>
-          <w:p>
-            <w:r>
-              <w:t>18</w:t>
-            </w:r>
-          </w:p>
-        </w:tc>
-        <w:tc>
-          <w:tcPr>
-            <w:tcW w:w="2410" w:type="dxa"/>
-          </w:tcPr>
-          <w:p>
-            <w:pPr>
-              <w:rPr>
-                <w:lang w:val="it-IT"/>
-              </w:rPr>
-            </w:pPr>
-            <w:r>
-              <w:rPr>
-                <w:lang w:val="it-IT"/>
-              </w:rPr>
-              <w:t>Soglia ADX per conferma trend micro</w:t>
-            </w:r>
-          </w:p>
-        </w:tc>
-        <w:tc>
-          <w:tcPr>
-            <w:tcW w:w="1701" w:type="dxa"/>
-          </w:tcPr>
-          <w:p>
-            <w:r>
-              <w:t>16–22</w:t>
-            </w:r>
-          </w:p>
-        </w:tc>
-        <w:tc>
-          <w:tcPr>
-            <w:tcW w:w="2410" w:type="dxa"/>
-          </w:tcPr>
-          <w:p>
-            <w:r>
-              <w:t>ADX_EXIT = ADX_LEVEL - 4</w:t>
-            </w:r>
-          </w:p>
-        </w:tc>
-      </w:tr>
-      <w:tr>
-        <w:tc>
-          <w:tcPr>
-            <w:tcW w:w="2093" w:type="dxa"/>
-          </w:tcPr>
-          <w:p>
-            <w:r>
-              <w:t>RANGE_COMPRESS</w:t>
-            </w:r>
-            <w:r>
-              <w:lastRenderedPageBreak/>
-              <w:t>ION</w:t>
-            </w:r>
-          </w:p>
-        </w:tc>
-        <w:tc>
-          <w:tcPr>
-            <w:tcW w:w="992" w:type="dxa"/>
-          </w:tcPr>
-          <w:p>
-            <w:r>
-              <w:lastRenderedPageBreak/>
-              <w:t>25</w:t>
-            </w:r>
-          </w:p>
-        </w:tc>
-        <w:tc>
-          <w:tcPr>
-            <w:tcW w:w="2410" w:type="dxa"/>
-          </w:tcPr>
-          <w:p>
-            <w:r>
-              <w:t xml:space="preserve">Percentile BBWidth </w:t>
-            </w:r>
-            <w:r>
-              <w:lastRenderedPageBreak/>
-              <w:t>per RANGE_LOW_VOL</w:t>
-            </w:r>
-          </w:p>
-        </w:tc>
-        <w:tc>
-          <w:tcPr>
-            <w:tcW w:w="1701" w:type="dxa"/>
-          </w:tcPr>
-          <w:p>
-            <w:r>
-              <w:lastRenderedPageBreak/>
-              <w:t>20–30</w:t>
-            </w:r>
-          </w:p>
-        </w:tc>
-        <w:tc>
-          <w:tcPr>
-            <w:tcW w:w="2410" w:type="dxa"/>
-          </w:tcPr>
-          <w:p>
-            <w:r>
-              <w:t xml:space="preserve">BB_P_EXIT = +10 (es. </w:t>
-            </w:r>
-            <w:r>
-              <w:lastRenderedPageBreak/>
-              <w:t>35)</w:t>
-            </w:r>
-          </w:p>
-        </w:tc>
-      </w:tr>
-      <w:tr>
-        <w:tc>
-          <w:tcPr>
-            <w:tcW w:w="2093" w:type="dxa"/>
-          </w:tcPr>
-          <w:p>
-            <w:r>
-              <w:lastRenderedPageBreak/>
-              <w:t>PERSISTENCE</w:t>
-            </w:r>
-          </w:p>
-        </w:tc>
-        <w:tc>
-          <w:tcPr>
-            <w:tcW w:w="992" w:type="dxa"/>
-          </w:tcPr>
-          <w:p>
-            <w:r>
-              <w:t>3</w:t>
-            </w:r>
-          </w:p>
-        </w:tc>
-        <w:tc>
-          <w:tcPr>
-            <w:tcW w:w="2410" w:type="dxa"/>
-          </w:tcPr>
-          <w:p>
-            <w:r>
-              <w:t>Barre consecutive (isteresi FSM)</w:t>
-            </w:r>
-          </w:p>
-        </w:tc>
-        <w:tc>
-          <w:tcPr>
-            <w:tcW w:w="1701" w:type="dxa"/>
-          </w:tcPr>
-          <w:p>
-            <w:r>
-              <w:t>2–5</w:t>
-            </w:r>
-          </w:p>
-        </w:tc>
-        <w:tc>
-          <w:tcPr>
-            <w:tcW w:w="2410" w:type="dxa"/>
-          </w:tcPr>
-          <w:p>
-            <w:r>
-              <w:t>K_enter=P</w:t>
-            </w:r>
-            <w:r>
-              <w:br/>
-              <w:t>K_exit=max(2,P-1)</w:t>
-            </w:r>
-          </w:p>
-        </w:tc>
-      </w:tr>
-    </w:tbl>
-    <w:p/>
-    <w:p>
-      <w:pPr>
-        <w:pStyle w:val="Titolo3"/>
-        <w:rPr>
-          <w:lang w:val="it-IT"/>
-        </w:rPr>
-      </w:pPr>
-      <w:r>
-        <w:rPr>
-          <w:lang w:val="it-IT"/>
-        </w:rPr>
-        <w:t>11.2 Parametri derivati (non esposti)</w:t>
-      </w:r>
-    </w:p>
-    <w:p>
-      <w:pPr>
-        <w:rPr>
-          <w:lang w:val="it-IT"/>
-        </w:rPr>
-      </w:pPr>
-      <w:r>
-        <w:rPr>
-          <w:lang w:val="it-IT"/>
-        </w:rPr>
-        <w:t xml:space="preserve">Parametri derivati automaticamente dai parametri esposti (riduzione gradi di libertà e </w:t>
-      </w:r>
-      <w:proofErr w:type="spellStart"/>
-      <w:r>
-        <w:rPr>
-          <w:lang w:val="it-IT"/>
-        </w:rPr>
-        <w:t>overfitting</w:t>
-      </w:r>
-      <w:proofErr w:type="spellEnd"/>
-      <w:r>
-        <w:rPr>
-          <w:lang w:val="it-IT"/>
-        </w:rPr>
-        <w:t>):</w:t>
-      </w:r>
-    </w:p>
-    <w:p>
-      <w:pPr>
-        <w:pStyle w:val="Puntoelenco"/>
-      </w:pPr>
-      <w:r>
-        <w:t>ADX_EXIT = ADX_LEVEL - 4</w:t>
-      </w:r>
-    </w:p>
-    <w:p>
-      <w:pPr>
-        <w:pStyle w:val="Puntoelenco"/>
-      </w:pPr>
-      <w:r>
-        <w:t>BB_P_ENTER = RANGE_COMPRESSION (percentile)</w:t>
-      </w:r>
-    </w:p>
-    <w:p>
-      <w:pPr>
-        <w:pStyle w:val="Puntoelenco"/>
-      </w:pPr>
-      <w:r>
-        <w:t>BB_P_EXIT = RANGE_COMPRESSION + 10 (percentil</w:t>
-      </w:r>
-      <w:r>
-        <w:t>e)</w:t>
-      </w:r>
-    </w:p>
-    <w:p>
-      <w:pPr>
-        <w:pStyle w:val="Puntoelenco"/>
-      </w:pPr>
-      <w:r>
-        <w:t>K_enter = PERSISTENCE</w:t>
-      </w:r>
-    </w:p>
-    <w:p>
-      <w:pPr>
-        <w:pStyle w:val="Puntoelenco"/>
-      </w:pPr>
-      <w:r>
-        <w:t>K_exit = max(2, PERSISTENCE - 1)</w:t>
-      </w:r>
-    </w:p>
-    <w:p/>
-    <w:p>
-      <w:pPr>
-        <w:pStyle w:val="Titolo3"/>
-      </w:pPr>
-      <w:r>
-        <w:t>11.3 Default completi (riassunto)</w:t>
-      </w:r>
-    </w:p>
-    <w:p>
-      <w:pPr>
-        <w:pStyle w:val="Puntoelenco"/>
-      </w:pPr>
-      <w:r>
-        <w:t>L_MACRO = 90</w:t>
-      </w:r>
-    </w:p>
-    <w:p>
-      <w:pPr>
-        <w:pStyle w:val="Puntoelenco"/>
-      </w:pPr>
-      <w:r>
-        <w:t>TREND_STRENGTH = 0.35</w:t>
-      </w:r>
-    </w:p>
-    <w:p>
-      <w:pPr>
-        <w:pStyle w:val="Puntoelenco"/>
-      </w:pPr>
-      <w:r>
-        <w:t>ADX_LEVEL = 18  (=&gt; ADX_EXIT = 14)</w:t>
-      </w:r>
-    </w:p>
-    <w:p>
-      <w:pPr>
-        <w:pStyle w:val="Puntoelenco"/>
-      </w:pPr>
-      <w:r>
-        <w:t>RANGE_COMPRESSION = 25  (=&gt; BB_P_EXIT = 35)</w:t>
-      </w:r>
-    </w:p>
-    <w:p>
-      <w:pPr>
-        <w:pStyle w:val="Puntoelenco"/>
-      </w:pPr>
-      <w:r>
-        <w:t>PERSISTENCE = 3  (=&gt; K_enter = 3, K_exit = 2)</w:t>
-      </w:r>
-    </w:p>
-    <w:p>
-      <w:pPr>
-        <w:pStyle w:val="Titolo2"/>
-        <w:rPr>
-          <w:lang w:val="it-IT"/>
-        </w:rPr>
-      </w:pPr>
-      <w:r>
-        <w:rPr>
-          <w:lang w:val="it-IT"/>
-        </w:rPr>
-        <w:t>Appendice A – Macchina a Stati (FSM)</w:t>
-      </w:r>
-    </w:p>
-    <w:p>
-      <w:pPr>
-        <w:rPr>
-          <w:lang w:val="it-IT"/>
-        </w:rPr>
-      </w:pPr>
-      <w:r>
-        <w:rPr>
-          <w:lang w:val="it-IT"/>
-        </w:rPr>
-        <w:t>La classificazione finale del regime è ottenuta tramite una macchina a stati</w:t>
-      </w:r>
-      <w:r>
-        <w:rPr>
-          <w:lang w:val="it-IT"/>
-        </w:rPr>
-        <w:t xml:space="preserve"> finiti (FSM) con memoria e isteresi. Lo schema seguente descrive gli stati, le transizioni e le condizioni di </w:t>
-      </w:r>
-      <w:proofErr w:type="spellStart"/>
-      <w:r>
-        <w:rPr>
-          <w:lang w:val="it-IT"/>
-        </w:rPr>
-        <w:t>switch</w:t>
-      </w:r>
-      <w:proofErr w:type="spellEnd"/>
-      <w:r>
-        <w:rPr>
-          <w:lang w:val="it-IT"/>
-        </w:rPr>
-        <w:t xml:space="preserve"> in forma compatta e implementabile.</w:t>
-      </w:r>
-    </w:p>
-    <w:p>
-      <w:pPr>
-        <w:pStyle w:val="Titolo3"/>
-      </w:pPr>
-      <w:r>
-        <w:t xml:space="preserve">A.1 </w:t>
-      </w:r>
-      <w:proofErr w:type="spellStart"/>
-      <w:r>
-        <w:t>Stati</w:t>
-      </w:r>
-      <w:proofErr w:type="spellEnd"/>
-    </w:p>
-    <w:p>
-      <w:pPr>
-        <w:pStyle w:val="Puntoelenco"/>
-      </w:pPr>
-      <w:r>
-        <w:t>MIXED (0): stato di transizione / incertezza</w:t>
-      </w:r>
-    </w:p>
-    <w:p>
-      <w:pPr>
-        <w:pStyle w:val="Puntoelenco"/>
-        <w:rPr>
-          <w:lang w:val="it-IT"/>
-        </w:rPr>
-      </w:pPr>
-      <w:r>
-        <w:rPr>
-          <w:lang w:val="it-IT"/>
-        </w:rPr>
-        <w:t>RANGE_LOW_VOL (1): laterale con compressione di</w:t>
-      </w:r>
-      <w:r>
-        <w:rPr>
-          <w:lang w:val="it-IT"/>
-        </w:rPr>
-        <w:t xml:space="preserve"> volatilità</w:t>
-      </w:r>
-    </w:p>
-    <w:p>
-      <w:pPr>
-        <w:pStyle w:val="Puntoelenco"/>
-      </w:pPr>
-      <w:r>
-        <w:t xml:space="preserve">TREND (2): trend </w:t>
-      </w:r>
-      <w:proofErr w:type="spellStart"/>
-      <w:r>
-        <w:t>strutturale</w:t>
-      </w:r>
-      <w:proofErr w:type="spellEnd"/>
-      <w:r>
-        <w:t xml:space="preserve"> attivo</w:t>
-      </w:r>
-    </w:p>
-    <w:p>
-      <w:pPr>
-        <w:pStyle w:val="Titolo3"/>
-        <w:rPr>
-          <w:lang w:val="it-IT"/>
-        </w:rPr>
-      </w:pPr>
-      <w:r>
-        <w:rPr>
-          <w:lang w:val="it-IT"/>
-        </w:rPr>
-        <w:t>A.2 Regole di transizione (sintesi)</w:t>
-      </w:r>
-    </w:p>
-    <w:tbl>
-      <w:tblPr>
-        <w:tblStyle w:val="Grigliatabella"/>
-        <w:tblW w:w="0" w:type="auto"/>
-        <w:tblLook w:val="04A0" w:firstRow="1" w:lastRow="0" w:firstColumn="1" w:lastColumn="0" w:noHBand="0" w:noVBand="1"/>
-      </w:tblPr>
-      <w:tblGrid>
-        <w:gridCol w:w="2880"/>
-        <w:gridCol w:w="2880"/>
-        <w:gridCol w:w="2880"/>
-      </w:tblGrid>
-      <w:tr>
-        <w:tc>
-          <w:tcPr>
-            <w:tcW w:w="2880" w:type="dxa"/>
-          </w:tcPr>
-          <w:p>
-            <w:r>
-              <w:t xml:space="preserve">Da </w:t>
-            </w:r>
-            <w:proofErr w:type="spellStart"/>
-            <w:r>
-              <w:t>stato</w:t>
-            </w:r>
-            <w:proofErr w:type="spellEnd"/>
-          </w:p>
-        </w:tc>
-        <w:tc>
-          <w:tcPr>
-            <w:tcW w:w="2880" w:type="dxa"/>
-          </w:tcPr>
-          <w:p>
-            <w:r>
-              <w:t>Condizione (persistenza K)</w:t>
-            </w:r>
-          </w:p>
-        </w:tc>
-        <w:tc>
-          <w:tcPr>
-            <w:tcW w:w="2880" w:type="dxa"/>
-          </w:tcPr>
-          <w:p>
-            <w:r>
-              <w:t>A stato</w:t>
-            </w:r>
-          </w:p>
-        </w:tc>
-      </w:tr>
-      <w:tr>
-        <w:tc>
-          <w:tcPr>
-            <w:tcW w:w="2880" w:type="dxa"/>
-          </w:tcPr>
-          <w:p>
-            <w:r>
-              <w:t>MIXED</w:t>
-            </w:r>
-          </w:p>
-        </w:tc>
-        <w:tc>
-          <w:tcPr>
-            <w:tcW w:w="2880" w:type="dxa"/>
-          </w:tcPr>
-          <w:p>
-            <w:r>
-              <w:t>MACRO=TREND AND (RAW_TREND OR EMA) per K_enter</w:t>
-            </w:r>
-          </w:p>
-        </w:tc>
-        <w:tc>
-          <w:tcPr>
-            <w:tcW w:w="2880" w:type="dxa"/>
-          </w:tcPr>
-          <w:p>
-            <w:r>
-              <w:t>TREND</w:t>
-            </w:r>
-          </w:p>
-        </w:tc>
-      </w:tr>
-      <w:tr>
-        <w:tc>
-          <w:tcPr>
-            <w:tcW w:w="2880" w:type="dxa"/>
-          </w:tcPr>
-          <w:p>
-            <w:r>
-              <w:t>MIXED</w:t>
-            </w:r>
-          </w:p>
-        </w:tc>
-        <w:tc>
-          <w:tcPr>
-            <w:tcW w:w="2880" w:type="dxa"/>
-          </w:tcPr>
-          <w:p>
-            <w:r>
-              <w:t>MACRO≠TREND AND RAW_RANGE_LOW_VOL per K_enter</w:t>
-            </w:r>
-          </w:p>
-        </w:tc>
-        <w:tc>
-          <w:tcPr>
-            <w:tcW w:w="2880" w:type="dxa"/>
-          </w:tcPr>
-          <w:p>
-            <w:r>
-              <w:t>RANGE_LOW_VOL</w:t>
-            </w:r>
-          </w:p>
-        </w:tc>
-      </w:tr>
-      <w:tr>
-        <w:tc>
-          <w:tcPr>
-            <w:tcW w:w="2880" w:type="dxa"/>
-          </w:tcPr>
-          <w:p>
-            <w:r>
-              <w:t>TREND</w:t>
-            </w:r>
-          </w:p>
-        </w:tc>
-        <w:tc>
-          <w:tcPr>
-            <w:tcW w:w="2880" w:type="dxa"/>
-          </w:tcPr>
-          <w:p>
-            <w:r>
-              <w:t>MACRO≠TREND OR ADX&lt;ADX_EXIT per K_exit</w:t>
-            </w:r>
-          </w:p>
-        </w:tc>
-        <w:tc>
-          <w:tcPr>
-            <w:tcW w:w="2880" w:type="dxa"/>
-          </w:tcPr>
-          <w:p>
-            <w:r>
-              <w:t>MIXED</w:t>
-            </w:r>
-          </w:p>
-        </w:tc>
-      </w:tr>
-      <w:tr>
-        <w:tc>
-          <w:tcPr>
-            <w:tcW w:w="2880" w:type="dxa"/>
-          </w:tcPr>
-          <w:p>
-            <w:r>
-              <w:t>RANGE_LOW_VOL</w:t>
-            </w:r>
-          </w:p>
-        </w:tc>
-        <w:tc>
-          <w:tcPr>
-            <w:tcW w:w="2880" w:type="dxa"/>
-          </w:tcPr>
-          <w:p>
-            <w:pPr>
-              <w:rPr>
-                <w:lang w:val="it-IT"/>
-              </w:rPr>
-            </w:pPr>
-            <w:r>
-              <w:rPr>
-                <w:lang w:val="it-IT"/>
-              </w:rPr>
-              <w:t xml:space="preserve">Volatilità in espansione per </w:t>
-            </w:r>
-            <w:proofErr w:type="spellStart"/>
-            <w:r>
-              <w:rPr>
-                <w:lang w:val="it-IT"/>
-              </w:rPr>
-              <w:t>K_exit</w:t>
-            </w:r>
-            <w:proofErr w:type="spellEnd"/>
-          </w:p>
-        </w:tc>
-        <w:tc>
-          <w:tcPr>
-            <w:tcW w:w="2880" w:type="dxa"/>
-          </w:tcPr>
-          <w:p>
-            <w:r>
-              <w:t>MIXED</w:t>
-            </w:r>
-          </w:p>
-        </w:tc>
-      </w:tr>
-      <w:tr>
-        <w:tc>
-          <w:tcPr>
-            <w:tcW w:w="2880" w:type="dxa"/>
-          </w:tcPr>
-          <w:p>
-            <w:r>
-              <w:lastRenderedPageBreak/>
-              <w:t>RANGE_LOW_VOL</w:t>
-            </w:r>
-          </w:p>
-        </w:tc>
-        <w:tc>
-          <w:tcPr>
-            <w:tcW w:w="2880" w:type="dxa"/>
-          </w:tcPr>
-          <w:p>
-            <w:r>
-              <w:t>MACRO=TREND AND (RAW_TREND OR EMA) per K_enter</w:t>
-            </w:r>
-          </w:p>
-        </w:tc>
-        <w:tc>
-          <w:tcPr>
-            <w:tcW w:w="2880" w:type="dxa"/>
-          </w:tcPr>
-          <w:p>
-            <w:r>
-              <w:t>TREND</w:t>
-            </w:r>
-          </w:p>
-        </w:tc>
-      </w:tr>
-    </w:tbl>
-    <w:p>
-      <w:pPr>
-        <w:pStyle w:val="Titolo3"/>
-      </w:pPr>
-      <w:r>
-        <w:t xml:space="preserve">A.3 Schema </w:t>
-      </w:r>
-      <w:proofErr w:type="spellStart"/>
-      <w:r>
-        <w:t>logico</w:t>
-      </w:r>
-      <w:proofErr w:type="spellEnd"/>
-    </w:p>
-    <w:p>
-      <w:r>
-        <w:rPr>
-          <w:rFonts w:ascii="Courier New" w:hAnsi="Courier New"/>
-          <w:noProof/>
-          <w:sz w:val="18"/>
-        </w:rPr>
-        <w:drawing>
-          <wp:inline distT="0" distB="0" distL="0" distR="0">
-            <wp:extent cx="3587687" cy="2542524"/>
-            <wp:effectExtent l="0" t="0" r="0" b="0"/>
-            <wp:docPr id="2" name="Immagine 2"/>
-            <wp:cNvGraphicFramePr>
-              <a:graphicFrameLocks xmlns:a="http://schemas.openxmlformats.org/drawingml/2006/main" noChangeAspect="1"/>
-            </wp:cNvGraphicFramePr>
-            <a:graphic xmlns:a="http://schemas.openxmlformats.org/drawingml/2006/main">
-              <a:graphicData uri="http://schemas.openxmlformats.org/drawingml/2006/picture">
-                <pic:pic xmlns:pic="http://schemas.openxmlformats.org/drawingml/2006/picture">
-                  <pic:nvPicPr>
-                    <pic:cNvPr id="2" name="Alice Bob Conversation Flow-2026-02-04-104756.png"/>
-                    <pic:cNvPicPr/>
-                  </pic:nvPicPr>
-                  <pic:blipFill>
-                    <a:blip r:embed="rId7"/>
-                    <a:stretch>
-                      <a:fillRect/>
-                    </a:stretch>
-                  </pic:blipFill>
-                  <pic:spPr>
-                    <a:xfrm>
-                      <a:off x="0" y="0"/>
-                      <a:ext cx="3593578" cy="2546699"/>
-                    </a:xfrm>
-                    <a:prstGeom prst="rect">
-                      <a:avLst/>
-                    </a:prstGeom>
-                  </pic:spPr>
-                </pic:pic>
-              </a:graphicData>
-            </a:graphic>
-          </wp:inline>
-        </w:drawing>
-      </w:r>
-      <w:r>
-        <w:rPr>
-          <w:rFonts w:ascii="Courier New" w:hAnsi="Courier New"/>
-          <w:sz w:val="18"/>
-        </w:rPr>
-        <w:t>```</w:t>
-      </w:r>
-      <w:r>
-        <w:rPr>
-          <w:rFonts w:ascii="Courier New" w:hAnsi="Courier New"/>
-          <w:sz w:val="18"/>
+      </w:r>
+      <w:r>
+        <w:rPr>
+          <w:lang w:val="it-IT"/>
         </w:rPr>
         <w:br/>
-      </w:r>
-    </w:p>
-    <w:p>
-      <w:pPr>
-        <w:pStyle w:val="Titolo2"/>
-        <w:rPr>
-          <w:lang w:val="it-IT"/>
-        </w:rPr>
-      </w:pPr>
-      <w:r>
-        <w:rPr>
-          <w:lang w:val="it-IT"/>
-        </w:rPr>
-        <w:t xml:space="preserve">Appendice B – Linee guida di </w:t>
-      </w:r>
-      <w:proofErr w:type="spellStart"/>
-      <w:r>
-        <w:rPr>
-          <w:lang w:val="it-IT"/>
-        </w:rPr>
-        <w:t>tuning</w:t>
-      </w:r>
-      <w:proofErr w:type="spellEnd"/>
-    </w:p>
-    <w:p>
-      <w:pPr>
-        <w:rPr>
-          <w:lang w:val="it-IT"/>
-        </w:rPr>
-      </w:pPr>
-      <w:r>
-        <w:rPr>
-          <w:lang w:val="it-IT"/>
-        </w:rPr>
-        <w:t xml:space="preserve">Questa </w:t>
-      </w:r>
-      <w:r>
-        <w:rPr>
-          <w:lang w:val="it-IT"/>
-        </w:rPr>
-        <w:t xml:space="preserve">appendice fornisce indicazioni operative su come intervenire sui parametri esposti, mantenendo la robustezza del modello ed evitando </w:t>
-      </w:r>
-      <w:proofErr w:type="spellStart"/>
-      <w:r>
-        <w:rPr>
-          <w:lang w:val="it-IT"/>
-        </w:rPr>
-        <w:t>overfitting</w:t>
-      </w:r>
-      <w:proofErr w:type="spellEnd"/>
-      <w:r>
-        <w:rPr>
-          <w:lang w:val="it-IT"/>
-        </w:rPr>
-        <w:t>.</w:t>
-      </w:r>
-    </w:p>
-    <w:p>
-      <w:pPr>
-        <w:pStyle w:val="Titolo3"/>
-      </w:pPr>
-      <w:r>
-        <w:t xml:space="preserve">B.1 </w:t>
-      </w:r>
-      <w:proofErr w:type="spellStart"/>
-      <w:r>
-        <w:t>Effetto</w:t>
-      </w:r>
-      <w:proofErr w:type="spellEnd"/>
-      <w:r>
-        <w:t xml:space="preserve"> </w:t>
-      </w:r>
-      <w:proofErr w:type="spellStart"/>
-      <w:r>
-        <w:t>dei</w:t>
-      </w:r>
-      <w:proofErr w:type="spellEnd"/>
-      <w:r>
-        <w:t xml:space="preserve"> </w:t>
-      </w:r>
-      <w:proofErr w:type="spellStart"/>
-      <w:r>
-        <w:t>parametri</w:t>
-      </w:r>
-      <w:proofErr w:type="spellEnd"/>
-      <w:r>
-        <w:t xml:space="preserve"> principali</w:t>
-      </w:r>
-    </w:p>
-    <w:tbl>
-      <w:tblPr>
-        <w:tblStyle w:val="Grigliatabella"/>
-        <w:tblW w:w="0" w:type="auto"/>
-        <w:tblLook w:val="04A0" w:firstRow="1" w:lastRow="0" w:firstColumn="1" w:lastColumn="0" w:noHBand="0" w:noVBand="1"/>
-      </w:tblPr>
-      <w:tblGrid>
-        <w:gridCol w:w="2400"/>
-        <w:gridCol w:w="2150"/>
-        <w:gridCol w:w="2152"/>
-        <w:gridCol w:w="2154"/>
-      </w:tblGrid>
-      <w:tr>
-        <w:tc>
-          <w:tcPr>
-            <w:tcW w:w="2160" w:type="dxa"/>
-          </w:tcPr>
-          <w:p>
-            <w:r>
-              <w:t>Parametro</w:t>
-            </w:r>
-          </w:p>
-        </w:tc>
-        <w:tc>
-          <w:tcPr>
-            <w:tcW w:w="2160" w:type="dxa"/>
-          </w:tcPr>
-          <w:p>
-            <w:r>
-              <w:t>Se aumenti</w:t>
-            </w:r>
-          </w:p>
-        </w:tc>
-        <w:tc>
-          <w:tcPr>
-            <w:tcW w:w="2160" w:type="dxa"/>
-          </w:tcPr>
-          <w:p>
-            <w:r>
-              <w:t>Se diminuisci</w:t>
-            </w:r>
-          </w:p>
-        </w:tc>
-        <w:tc>
-          <w:tcPr>
-            <w:tcW w:w="2160" w:type="dxa"/>
-          </w:tcPr>
-          <w:p>
-            <w:r>
-              <w:t>Nota di tuning</w:t>
-            </w:r>
-          </w:p>
-        </w:tc>
-      </w:tr>
-      <w:tr>
-        <w:tc>
-          <w:tcPr>
-            <w:tcW w:w="2160" w:type="dxa"/>
-          </w:tcPr>
-          <w:p>
-            <w:r>
-              <w:t>L_MACRO</w:t>
-            </w:r>
-          </w:p>
-        </w:tc>
-        <w:tc>
-          <w:tcPr>
-            <w:tcW w:w="2160" w:type="dxa"/>
-          </w:tcPr>
-          <w:p>
-            <w:pPr>
-              <w:rPr>
-                <w:lang w:val="it-IT"/>
-              </w:rPr>
-            </w:pPr>
-            <w:r>
-              <w:rPr>
-                <w:lang w:val="it-IT"/>
-              </w:rPr>
-              <w:t xml:space="preserve">Trend più </w:t>
-            </w:r>
-            <w:r>
-              <w:rPr>
-                <w:lang w:val="it-IT"/>
-              </w:rPr>
-              <w:t xml:space="preserve">stabili, più </w:t>
-            </w:r>
-            <w:proofErr w:type="spellStart"/>
-            <w:r>
-              <w:rPr>
-                <w:lang w:val="it-IT"/>
-              </w:rPr>
-              <w:t>lag</w:t>
-            </w:r>
-            <w:proofErr w:type="spellEnd"/>
-          </w:p>
-        </w:tc>
-        <w:tc>
-          <w:tcPr>
-            <w:tcW w:w="2160" w:type="dxa"/>
-          </w:tcPr>
-          <w:p>
-            <w:r>
-              <w:t xml:space="preserve">Trend </w:t>
-            </w:r>
-            <w:proofErr w:type="spellStart"/>
-            <w:r>
-              <w:t>più</w:t>
-            </w:r>
-            <w:proofErr w:type="spellEnd"/>
-            <w:r>
-              <w:t xml:space="preserve"> </w:t>
-            </w:r>
-            <w:proofErr w:type="spellStart"/>
-            <w:r>
-              <w:t>reattivi</w:t>
-            </w:r>
-            <w:proofErr w:type="spellEnd"/>
-          </w:p>
-        </w:tc>
-        <w:tc>
-          <w:tcPr>
-            <w:tcW w:w="2160" w:type="dxa"/>
-          </w:tcPr>
-          <w:p>
-            <w:r>
-              <w:t>Cambiare solo con timeframe</w:t>
-            </w:r>
-          </w:p>
-        </w:tc>
-      </w:tr>
-      <w:tr>
-        <w:tc>
-          <w:tcPr>
-            <w:tcW w:w="2160" w:type="dxa"/>
-          </w:tcPr>
-          <w:p>
-            <w:r>
-              <w:t>TREND_STRENGTH</w:t>
-            </w:r>
-          </w:p>
-        </w:tc>
-        <w:tc>
-          <w:tcPr>
-            <w:tcW w:w="2160" w:type="dxa"/>
-          </w:tcPr>
-          <w:p>
-            <w:r>
-              <w:t>Meno TREND, più selezione</w:t>
-            </w:r>
-          </w:p>
-        </w:tc>
-        <w:tc>
-          <w:tcPr>
-            <w:tcW w:w="2160" w:type="dxa"/>
-          </w:tcPr>
-          <w:p>
-            <w:r>
-              <w:t>Più TREND, rischio rumore</w:t>
-            </w:r>
-          </w:p>
-        </w:tc>
-        <w:tc>
-          <w:tcPr>
-            <w:tcW w:w="2160" w:type="dxa"/>
-          </w:tcPr>
-          <w:p>
-            <w:r>
-              <w:t>Non scendere &lt;0.25</w:t>
-            </w:r>
-          </w:p>
-        </w:tc>
-      </w:tr>
-      <w:tr>
-        <w:tc>
-          <w:tcPr>
-            <w:tcW w:w="2160" w:type="dxa"/>
-          </w:tcPr>
-          <w:p>
-            <w:r>
-              <w:t>ADX_LEVEL</w:t>
-            </w:r>
-          </w:p>
-        </w:tc>
-        <w:tc>
-          <w:tcPr>
-            <w:tcW w:w="2160" w:type="dxa"/>
-          </w:tcPr>
-          <w:p>
-            <w:r>
-              <w:t>Trend più puliti</w:t>
-            </w:r>
-          </w:p>
-        </w:tc>
-        <w:tc>
-          <w:tcPr>
-            <w:tcW w:w="2160" w:type="dxa"/>
-          </w:tcPr>
-          <w:p>
-            <w:r>
-              <w:t>Trend più frequenti</w:t>
-            </w:r>
-          </w:p>
-        </w:tc>
-        <w:tc>
-          <w:tcPr>
-            <w:tcW w:w="2160" w:type="dxa"/>
-          </w:tcPr>
-          <w:p>
-            <w:r>
-              <w:t>Regola ENTER/EXIT</w:t>
-            </w:r>
-          </w:p>
-        </w:tc>
-      </w:tr>
-      <w:tr>
-        <w:tc>
-          <w:tcPr>
-            <w:tcW w:w="2160" w:type="dxa"/>
-          </w:tcPr>
-          <w:p>
-            <w:r>
-              <w:t>RANGE_COMPRESSION</w:t>
-            </w:r>
-          </w:p>
-        </w:tc>
-        <w:tc>
-          <w:tcPr>
-            <w:tcW w:w="2160" w:type="dxa"/>
-          </w:tcPr>
-          <w:p>
-            <w:r>
-              <w:t>Range rari ma strett</w:t>
-            </w:r>
-            <w:r>
-              <w:t>i</w:t>
-            </w:r>
-          </w:p>
-        </w:tc>
-        <w:tc>
-          <w:tcPr>
-            <w:tcW w:w="2160" w:type="dxa"/>
-          </w:tcPr>
-          <w:p>
-            <w:r>
-              <w:t>Range frequenti</w:t>
-            </w:r>
-          </w:p>
-        </w:tc>
-        <w:tc>
-          <w:tcPr>
-            <w:tcW w:w="2160" w:type="dxa"/>
-          </w:tcPr>
-          <w:p>
-            <w:r>
-              <w:t>Usare percentili</w:t>
-            </w:r>
-          </w:p>
-        </w:tc>
-      </w:tr>
-      <w:tr>
-        <w:tc>
-          <w:tcPr>
-            <w:tcW w:w="2160" w:type="dxa"/>
-          </w:tcPr>
-          <w:p>
-            <w:r>
-              <w:t>PERSISTENCE</w:t>
-            </w:r>
-          </w:p>
-        </w:tc>
-        <w:tc>
-          <w:tcPr>
-            <w:tcW w:w="2160" w:type="dxa"/>
-          </w:tcPr>
-          <w:p>
-            <w:r>
-              <w:t>Meno switch, più inerzia</w:t>
-            </w:r>
-          </w:p>
-        </w:tc>
-        <w:tc>
-          <w:tcPr>
-            <w:tcW w:w="2160" w:type="dxa"/>
-          </w:tcPr>
-          <w:p>
-            <w:r>
-              <w:t>Più switch</w:t>
-            </w:r>
-          </w:p>
-        </w:tc>
-        <w:tc>
-          <w:tcPr>
-            <w:tcW w:w="2160" w:type="dxa"/>
-          </w:tcPr>
-          <w:p>
-            <w:r>
-              <w:t>Parametro più importante</w:t>
-            </w:r>
-          </w:p>
-        </w:tc>
-      </w:tr>
-    </w:tbl>
-    <w:p>
-      <w:pPr>
-        <w:pStyle w:val="Titolo3"/>
-      </w:pPr>
-      <w:r>
-        <w:t>B.2 Ordine consigliato di tuning</w:t>
-      </w:r>
-    </w:p>
-    <w:p>
-      <w:pPr>
-        <w:pStyle w:val="Numeroelenco"/>
-      </w:pPr>
-      <w:r>
-        <w:t>1. PERSISTENCE</w:t>
-      </w:r>
-    </w:p>
-    <w:p>
-      <w:pPr>
-        <w:pStyle w:val="Numeroelenco"/>
-      </w:pPr>
-      <w:r>
-        <w:t>2. ADX_LEVEL</w:t>
-      </w:r>
-    </w:p>
-    <w:p>
-      <w:pPr>
-        <w:pStyle w:val="Numeroelenco"/>
-      </w:pPr>
-      <w:r>
-        <w:t>3. RANGE_COMPRESSION</w:t>
-      </w:r>
-    </w:p>
-    <w:p>
-      <w:pPr>
-        <w:pStyle w:val="Numeroelenco"/>
-      </w:pPr>
-      <w:r>
-        <w:t>4. TREND_STRENGTH</w:t>
-      </w:r>
-    </w:p>
-    <w:p>
-      <w:pPr>
-        <w:pStyle w:val="Numeroelenco"/>
-        <w:rPr>
-          <w:lang w:val="it-IT"/>
-        </w:rPr>
-      </w:pPr>
-      <w:r>
-        <w:rPr>
-          <w:lang w:val="it-IT"/>
-        </w:rPr>
-        <w:t xml:space="preserve">5. L_MACRO (solo se cambia </w:t>
-      </w:r>
-      <w:proofErr w:type="spellStart"/>
-      <w:r>
-        <w:rPr>
-          <w:lang w:val="it-IT"/>
-        </w:rPr>
-        <w:t>timeframe</w:t>
-      </w:r>
-      <w:proofErr w:type="spellEnd"/>
-      <w:r>
-        <w:rPr>
-          <w:lang w:val="it-IT"/>
-        </w:rPr>
-        <w:t>)</w:t>
-      </w:r>
-      <w:bookmarkStart w:id="0" w:name="_GoBack"/>
-      <w:bookmarkEnd w:id="0"/>
+        <w:t>Esempi di estensione Livello 2:</w:t>
+      </w:r>
+      <w:r>
+        <w:rPr>
+          <w:lang w:val="it-IT"/>
+        </w:rPr>
+        <w:br/>
+        <w:t>- TREND → TREND_UP / TREND_DOWN</w:t>
+      </w:r>
+      <w:r>
+        <w:rPr>
+          <w:lang w:val="it-IT"/>
+        </w:rPr>
+        <w:br/>
+        <w:t>- RANGE → RANGE_LOW_VOL / RANGE_HIGH_VOL</w:t>
+      </w:r>
+      <w:r>
+        <w:rPr>
+          <w:lang w:val="it-IT"/>
+        </w:rPr>
+        <w:br/>
+      </w:r>
+      <w:r>
+        <w:rPr>
+          <w:lang w:val="it-IT"/>
+        </w:rPr>
+        <w:br/>
+        <w:t>Il Livello 2 non deve mai alterare le regole del Livello 1, ma solo raffinarle.</w:t>
+      </w:r>
     </w:p>
     <w:sectPr>
-      <w:pgSz w:w="12240" w:h="15840"/>
+      <w:footerReference w:type="even" r:id="rId9"/>
+      <w:footerReference w:type="default" r:id="rId10"/>
+      <w:pgSz w:w="11906" w:h="16838" w:code="9"/>
       <w:pgMar w:top="1440" w:right="1800" w:bottom="1440" w:left="1800" w:header="720" w:footer="720" w:gutter="0"/>
       <w:cols w:space="720"/>
       <w:docGrid w:linePitch="360"/>
     </w:sectPr>
   </w:body>
 </w:document>
+</file>
+
+<file path=word/endnotes.xml><?xml version="1.0" encoding="utf-8"?>
+<w:endnotes xmlns:wpc="http://schemas.microsoft.com/office/word/2010/wordprocessingCanvas" xmlns:cx="http://schemas.microsoft.com/office/drawing/2014/chartex" xmlns:cx1="http://schemas.microsoft.com/office/drawing/2015/9/8/chartex" xmlns:cx2="http://schemas.microsoft.com/office/drawing/2015/10/21/chartex" xmlns:cx3="http://schemas.microsoft.com/office/drawing/2016/5/9/chartex" xmlns:cx4="http://schemas.microsoft.com/office/drawing/2016/5/10/chartex" xmlns:cx5="http://schemas.microsoft.com/office/drawing/2016/5/11/chartex" xmlns:cx6="http://schemas.microsoft.com/office/drawing/2016/5/12/chartex" xmlns:cx7="http://schemas.microsoft.com/office/drawing/2016/5/13/chartex" xmlns:cx8="http://schemas.microsoft.com/office/drawing/2016/5/14/chartex" xmlns:mc="http://schemas.openxmlformats.org/markup-compatibility/2006" xmlns:aink="http://schemas.microsoft.com/office/drawing/2016/ink" xmlns:am3d="http://schemas.microsoft.com/office/drawing/2017/model3d" xmlns:o="urn:schemas-microsoft-com:office:office" xmlns:r="http://schemas.openxmlformats.org/officeDocument/2006/relationships" xmlns:m="http://schemas.openxmlformats.org/officeDocument/2006/math" xmlns:v="urn:schemas-microsoft-com:vml" xmlns:wp14="http://schemas.microsoft.com/office/word/2010/wordprocessingDrawing" xmlns:wp="http://schemas.openxmlformats.org/drawingml/2006/wordprocessingDrawing" xmlns:w10="urn:schemas-microsoft-com:office:word" xmlns:w="http://schemas.openxmlformats.org/wordprocessingml/2006/main" xmlns:w14="http://schemas.microsoft.com/office/word/2010/wordml" xmlns:w15="http://schemas.microsoft.com/office/word/2012/wordml" xmlns:w16cid="http://schemas.microsoft.com/office/word/2016/wordml/cid" xmlns:w16se="http://schemas.microsoft.com/office/word/2015/wordml/symex" xmlns:wpg="http://schemas.microsoft.com/office/word/2010/wordprocessingGroup" xmlns:wpi="http://schemas.microsoft.com/office/word/2010/wordprocessingInk" xmlns:wne="http://schemas.microsoft.com/office/word/2006/wordml" xmlns:wps="http://schemas.microsoft.com/office/word/2010/wordprocessingShape" mc:Ignorable="w14 w15 w16se w16cid wp14">
+  <w:endnote w:type="separator" w:id="-1">
+    <w:p>
+      <w:pPr>
+        <w:spacing w:after="0" w:line="240" w:lineRule="auto"/>
+      </w:pPr>
+      <w:r>
+        <w:separator/>
+      </w:r>
+    </w:p>
+  </w:endnote>
+  <w:endnote w:type="continuationSeparator" w:id="0">
+    <w:p>
+      <w:pPr>
+        <w:spacing w:after="0" w:line="240" w:lineRule="auto"/>
+      </w:pPr>
+      <w:r>
+        <w:continuationSeparator/>
+      </w:r>
+    </w:p>
+  </w:endnote>
+</w:endnotes>
+</file>
+
+<file path=word/footer1.xml><?xml version="1.0" encoding="utf-8"?>
+<w:ftr xmlns:wpc="http://schemas.microsoft.com/office/word/2010/wordprocessingCanvas" xmlns:cx="http://schemas.microsoft.com/office/drawing/2014/chartex" xmlns:cx1="http://schemas.microsoft.com/office/drawing/2015/9/8/chartex" xmlns:cx2="http://schemas.microsoft.com/office/drawing/2015/10/21/chartex" xmlns:cx3="http://schemas.microsoft.com/office/drawing/2016/5/9/chartex" xmlns:cx4="http://schemas.microsoft.com/office/drawing/2016/5/10/chartex" xmlns:cx5="http://schemas.microsoft.com/office/drawing/2016/5/11/chartex" xmlns:cx6="http://schemas.microsoft.com/office/drawing/2016/5/12/chartex" xmlns:cx7="http://schemas.microsoft.com/office/drawing/2016/5/13/chartex" xmlns:cx8="http://schemas.microsoft.com/office/drawing/2016/5/14/chartex" xmlns:mc="http://schemas.openxmlformats.org/markup-compatibility/2006" xmlns:aink="http://schemas.microsoft.com/office/drawing/2016/ink" xmlns:am3d="http://schemas.microsoft.com/office/drawing/2017/model3d" xmlns:o="urn:schemas-microsoft-com:office:office" xmlns:r="http://schemas.openxmlformats.org/officeDocument/2006/relationships" xmlns:m="http://schemas.openxmlformats.org/officeDocument/2006/math" xmlns:v="urn:schemas-microsoft-com:vml" xmlns:wp14="http://schemas.microsoft.com/office/word/2010/wordprocessingDrawing" xmlns:wp="http://schemas.openxmlformats.org/drawingml/2006/wordprocessingDrawing" xmlns:w10="urn:schemas-microsoft-com:office:word" xmlns:w="http://schemas.openxmlformats.org/wordprocessingml/2006/main" xmlns:w14="http://schemas.microsoft.com/office/word/2010/wordml" xmlns:w15="http://schemas.microsoft.com/office/word/2012/wordml" xmlns:w16cid="http://schemas.microsoft.com/office/word/2016/wordml/cid" xmlns:w16se="http://schemas.microsoft.com/office/word/2015/wordml/symex" xmlns:wpg="http://schemas.microsoft.com/office/word/2010/wordprocessingGroup" xmlns:wpi="http://schemas.microsoft.com/office/word/2010/wordprocessingInk" xmlns:wne="http://schemas.microsoft.com/office/word/2006/wordml" xmlns:wps="http://schemas.microsoft.com/office/word/2010/wordprocessingShape" mc:Ignorable="w14 w15 w16se w16cid wp14">
+  <w:sdt>
+    <w:sdtPr>
+      <w:rPr>
+        <w:rStyle w:val="Numeropagina"/>
+      </w:rPr>
+      <w:id w:val="71249204"/>
+      <w:docPartObj>
+        <w:docPartGallery w:val="Page Numbers (Bottom of Page)"/>
+        <w:docPartUnique/>
+      </w:docPartObj>
+    </w:sdtPr>
+    <w:sdtEndPr>
+      <w:rPr>
+        <w:rStyle w:val="Numeropagina"/>
+      </w:rPr>
+    </w:sdtEndPr>
+    <w:sdtContent>
+      <w:p>
+        <w:pPr>
+          <w:pStyle w:val="Pidipagina"/>
+          <w:framePr w:wrap="none" w:vAnchor="text" w:hAnchor="margin" w:xAlign="right" w:y="1"/>
+          <w:rPr>
+            <w:rStyle w:val="Numeropagina"/>
+          </w:rPr>
+        </w:pPr>
+        <w:r>
+          <w:rPr>
+            <w:rStyle w:val="Numeropagina"/>
+          </w:rPr>
+          <w:fldChar w:fldCharType="begin"/>
+        </w:r>
+        <w:r>
+          <w:rPr>
+            <w:rStyle w:val="Numeropagina"/>
+          </w:rPr>
+          <w:instrText xml:space="preserve"> PAGE </w:instrText>
+        </w:r>
+        <w:r>
+          <w:rPr>
+            <w:rStyle w:val="Numeropagina"/>
+          </w:rPr>
+          <w:fldChar w:fldCharType="end"/>
+        </w:r>
+      </w:p>
+    </w:sdtContent>
+  </w:sdt>
+  <w:p>
+    <w:pPr>
+      <w:pStyle w:val="Pidipagina"/>
+      <w:ind w:right="360"/>
+    </w:pPr>
+  </w:p>
+</w:ftr>
+</file>
+
+<file path=word/footer2.xml><?xml version="1.0" encoding="utf-8"?>
+<w:ftr xmlns:wpc="http://schemas.microsoft.com/office/word/2010/wordprocessingCanvas" xmlns:cx="http://schemas.microsoft.com/office/drawing/2014/chartex" xmlns:cx1="http://schemas.microsoft.com/office/drawing/2015/9/8/chartex" xmlns:cx2="http://schemas.microsoft.com/office/drawing/2015/10/21/chartex" xmlns:cx3="http://schemas.microsoft.com/office/drawing/2016/5/9/chartex" xmlns:cx4="http://schemas.microsoft.com/office/drawing/2016/5/10/chartex" xmlns:cx5="http://schemas.microsoft.com/office/drawing/2016/5/11/chartex" xmlns:cx6="http://schemas.microsoft.com/office/drawing/2016/5/12/chartex" xmlns:cx7="http://schemas.microsoft.com/office/drawing/2016/5/13/chartex" xmlns:cx8="http://schemas.microsoft.com/office/drawing/2016/5/14/chartex" xmlns:mc="http://schemas.openxmlformats.org/markup-compatibility/2006" xmlns:aink="http://schemas.microsoft.com/office/drawing/2016/ink" xmlns:am3d="http://schemas.microsoft.com/office/drawing/2017/model3d" xmlns:o="urn:schemas-microsoft-com:office:office" xmlns:r="http://schemas.openxmlformats.org/officeDocument/2006/relationships" xmlns:m="http://schemas.openxmlformats.org/officeDocument/2006/math" xmlns:v="urn:schemas-microsoft-com:vml" xmlns:wp14="http://schemas.microsoft.com/office/word/2010/wordprocessingDrawing" xmlns:wp="http://schemas.openxmlformats.org/drawingml/2006/wordprocessingDrawing" xmlns:w10="urn:schemas-microsoft-com:office:word" xmlns:w="http://schemas.openxmlformats.org/wordprocessingml/2006/main" xmlns:w14="http://schemas.microsoft.com/office/word/2010/wordml" xmlns:w15="http://schemas.microsoft.com/office/word/2012/wordml" xmlns:w16cid="http://schemas.microsoft.com/office/word/2016/wordml/cid" xmlns:w16se="http://schemas.microsoft.com/office/word/2015/wordml/symex" xmlns:wpg="http://schemas.microsoft.com/office/word/2010/wordprocessingGroup" xmlns:wpi="http://schemas.microsoft.com/office/word/2010/wordprocessingInk" xmlns:wne="http://schemas.microsoft.com/office/word/2006/wordml" xmlns:wps="http://schemas.microsoft.com/office/word/2010/wordprocessingShape" mc:Ignorable="w14 w15 w16se w16cid wp14">
+  <w:sdt>
+    <w:sdtPr>
+      <w:rPr>
+        <w:rStyle w:val="Numeropagina"/>
+      </w:rPr>
+      <w:id w:val="1623571571"/>
+      <w:docPartObj>
+        <w:docPartGallery w:val="Page Numbers (Bottom of Page)"/>
+        <w:docPartUnique/>
+      </w:docPartObj>
+    </w:sdtPr>
+    <w:sdtEndPr>
+      <w:rPr>
+        <w:rStyle w:val="Numeropagina"/>
+      </w:rPr>
+    </w:sdtEndPr>
+    <w:sdtContent>
+      <w:p>
+        <w:pPr>
+          <w:pStyle w:val="Pidipagina"/>
+          <w:framePr w:wrap="none" w:vAnchor="text" w:hAnchor="margin" w:xAlign="right" w:y="1"/>
+          <w:rPr>
+            <w:rStyle w:val="Numeropagina"/>
+          </w:rPr>
+        </w:pPr>
+        <w:r>
+          <w:rPr>
+            <w:rStyle w:val="Numeropagina"/>
+          </w:rPr>
+          <w:fldChar w:fldCharType="begin"/>
+        </w:r>
+        <w:r>
+          <w:rPr>
+            <w:rStyle w:val="Numeropagina"/>
+          </w:rPr>
+          <w:instrText xml:space="preserve"> PAGE </w:instrText>
+        </w:r>
+        <w:r>
+          <w:rPr>
+            <w:rStyle w:val="Numeropagina"/>
+          </w:rPr>
+          <w:fldChar w:fldCharType="separate"/>
+        </w:r>
+        <w:r>
+          <w:rPr>
+            <w:rStyle w:val="Numeropagina"/>
+            <w:noProof/>
+          </w:rPr>
+          <w:t>1</w:t>
+        </w:r>
+        <w:r>
+          <w:rPr>
+            <w:rStyle w:val="Numeropagina"/>
+          </w:rPr>
+          <w:fldChar w:fldCharType="end"/>
+        </w:r>
+      </w:p>
+    </w:sdtContent>
+  </w:sdt>
+  <w:p>
+    <w:pPr>
+      <w:pStyle w:val="Pidipagina"/>
+      <w:ind w:right="360"/>
+    </w:pPr>
+  </w:p>
+</w:ftr>
+</file>
+
+<file path=word/footnotes.xml><?xml version="1.0" encoding="utf-8"?>
+<w:footnotes xmlns:wpc="http://schemas.microsoft.com/office/word/2010/wordprocessingCanvas" xmlns:cx="http://schemas.microsoft.com/office/drawing/2014/chartex" xmlns:cx1="http://schemas.microsoft.com/office/drawing/2015/9/8/chartex" xmlns:cx2="http://schemas.microsoft.com/office/drawing/2015/10/21/chartex" xmlns:cx3="http://schemas.microsoft.com/office/drawing/2016/5/9/chartex" xmlns:cx4="http://schemas.microsoft.com/office/drawing/2016/5/10/chartex" xmlns:cx5="http://schemas.microsoft.com/office/drawing/2016/5/11/chartex" xmlns:cx6="http://schemas.microsoft.com/office/drawing/2016/5/12/chartex" xmlns:cx7="http://schemas.microsoft.com/office/drawing/2016/5/13/chartex" xmlns:cx8="http://schemas.microsoft.com/office/drawing/2016/5/14/chartex" xmlns:mc="http://schemas.openxmlformats.org/markup-compatibility/2006" xmlns:aink="http://schemas.microsoft.com/office/drawing/2016/ink" xmlns:am3d="http://schemas.microsoft.com/office/drawing/2017/model3d" xmlns:o="urn:schemas-microsoft-com:office:office" xmlns:r="http://schemas.openxmlformats.org/officeDocument/2006/relationships" xmlns:m="http://schemas.openxmlformats.org/officeDocument/2006/math" xmlns:v="urn:schemas-microsoft-com:vml" xmlns:wp14="http://schemas.microsoft.com/office/word/2010/wordprocessingDrawing" xmlns:wp="http://schemas.openxmlformats.org/drawingml/2006/wordprocessingDrawing" xmlns:w10="urn:schemas-microsoft-com:office:word" xmlns:w="http://schemas.openxmlformats.org/wordprocessingml/2006/main" xmlns:w14="http://schemas.microsoft.com/office/word/2010/wordml" xmlns:w15="http://schemas.microsoft.com/office/word/2012/wordml" xmlns:w16cid="http://schemas.microsoft.com/office/word/2016/wordml/cid" xmlns:w16se="http://schemas.microsoft.com/office/word/2015/wordml/symex" xmlns:wpg="http://schemas.microsoft.com/office/word/2010/wordprocessingGroup" xmlns:wpi="http://schemas.microsoft.com/office/word/2010/wordprocessingInk" xmlns:wne="http://schemas.microsoft.com/office/word/2006/wordml" xmlns:wps="http://schemas.microsoft.com/office/word/2010/wordprocessingShape" mc:Ignorable="w14 w15 w16se w16cid wp14">
+  <w:footnote w:type="separator" w:id="-1">
+    <w:p>
+      <w:pPr>
+        <w:spacing w:after="0" w:line="240" w:lineRule="auto"/>
+      </w:pPr>
+      <w:r>
+        <w:separator/>
+      </w:r>
+    </w:p>
+  </w:footnote>
+  <w:footnote w:type="continuationSeparator" w:id="0">
+    <w:p>
+      <w:pPr>
+        <w:spacing w:after="0" w:line="240" w:lineRule="auto"/>
+      </w:pPr>
+      <w:r>
+        <w:continuationSeparator/>
+      </w:r>
+    </w:p>
+  </w:footnote>
+</w:footnotes>
 </file>
 
 <file path=word/numbering.xml><?xml version="1.0" encoding="utf-8"?>
@@ -3202,10 +2192,6 @@
     <w:lsdException w:name="Book Title" w:uiPriority="33" w:qFormat="1"/>
     <w:lsdException w:name="Bibliography" w:semiHidden="1" w:uiPriority="37" w:unhideWhenUsed="1"/>
     <w:lsdException w:name="TOC Heading" w:semiHidden="1" w:uiPriority="39" w:unhideWhenUsed="1" w:qFormat="1"/>
-    <w:lsdException w:name="Grid Table Light" w:semiHidden="1" w:unhideWhenUsed="1"/>
-    <w:lsdException w:name="Grid Table 1 Light" w:semiHidden="1" w:unhideWhenUsed="1"/>
-    <w:lsdException w:name="Grid Table 2" w:semiHidden="1" w:unhideWhenUsed="1"/>
-    <w:lsdException w:name="Grid Table 3" w:semiHidden="1" w:unhideWhenUsed="1"/>
     <w:lsdException w:name="Grid Table 4" w:uiPriority="49"/>
     <w:lsdException w:name="Grid Table 5 Dark" w:uiPriority="50"/>
     <w:lsdException w:name="Grid Table 6 Colorful" w:uiPriority="51"/>
@@ -3523,7 +2509,6 @@
   <w:style w:type="character" w:default="1" w:styleId="Carpredefinitoparagrafo">
     <w:name w:val="Default Paragraph Font"/>
     <w:uiPriority w:val="1"/>
-    <w:semiHidden/>
     <w:unhideWhenUsed/>
   </w:style>
   <w:style w:type="table" w:default="1" w:styleId="Tabellanormale">
@@ -14299,6 +13284,14 @@
         <w:shd w:val="clear" w:color="auto" w:fill="FBCAA2" w:themeFill="accent6" w:themeFillTint="7F"/>
       </w:tcPr>
     </w:tblStylePr>
+  </w:style>
+  <w:style w:type="character" w:styleId="Numeropagina">
+    <w:name w:val="page number"/>
+    <w:basedOn w:val="Carpredefinitoparagrafo"/>
+    <w:uiPriority w:val="99"/>
+    <w:semiHidden/>
+    <w:unhideWhenUsed/>
+    <w:rsid w:val="00B102D4"/>
   </w:style>
 </w:styles>
 </file>
@@ -14628,7 +13621,7 @@
 </file>
 
 <file path=customXml/itemProps1.xml><?xml version="1.0" encoding="utf-8"?>
-<ds:datastoreItem xmlns:ds="http://schemas.openxmlformats.org/officeDocument/2006/customXml" ds:itemID="{C3F50C12-783B-2045-8ABD-A72B8A6BD473}">
+<ds:datastoreItem xmlns:ds="http://schemas.openxmlformats.org/officeDocument/2006/customXml" ds:itemID="{A4BD7BFE-44E8-0844-8AD5-9C4681A8EC52}">
   <ds:schemaRefs>
     <ds:schemaRef ds:uri="http://schemas.openxmlformats.org/officeDocument/2006/bibliography"/>
   </ds:schemaRefs>

</xml_diff>